<commit_message>
Codigo de cada método terminado, a falta de pruebas.
</commit_message>
<xml_diff>
--- a/Actividad 1.docx
+++ b/Actividad 1.docx
@@ -182,6 +182,1542 @@
       </w:r>
     </w:p>
     <w:p>
+      <w:r>
+        <w:t>El método de búsqueda dicotómica es una técnica iterativa utilizada para encontrar el mínimo de una función en un intervalo donde se sabe que es unimodal, es decir, que presenta un único mínimo. El procedimiento consiste en reducir progresivamente el intervalo de búsqueda evaluando la función en dos puntos cercanos al punto medio del intervalo actual.</w:t>
+      </w:r>
+    </w:p>
+    <w:p>
+      <w:r>
+        <w:t>En cada iteración, se calcula el punto medio del intervalo y se evalúa la función en dos puntos ligeramente desplazados a ambos lados de dicho punto. Comparando los valores obtenidos, se determina en qué subintervalo se encuentra el mínimo y se descarta la otra mitad del intervalo. Este proceso se repite hasta que la longitud del intervalo es suficientemente pequeña, lo que permite aproximar el valor del mínimo con la precisión deseada.</w:t>
+      </w:r>
+    </w:p>
+    <w:p>
+      <w:r>
+        <w:t>Se trata de un método sencillo y robusto, aunque puede requerir un número elevado de iteraciones, especialmente si se busca una alta precisión.</w:t>
+      </w:r>
+    </w:p>
+    <w:tbl>
+      <w:tblPr>
+        <w:tblStyle w:val="Tablaconcuadrcula"/>
+        <w:tblW w:w="0" w:type="auto"/>
+        <w:tblLook w:val="04A0" w:firstRow="1" w:lastRow="0" w:firstColumn="1" w:lastColumn="0" w:noHBand="0" w:noVBand="1"/>
+      </w:tblPr>
+      <w:tblGrid>
+        <w:gridCol w:w="8296"/>
+      </w:tblGrid>
+      <w:tr>
+        <w:trPr>
+          <w:cantSplit/>
+        </w:trPr>
+        <w:tc>
+          <w:tcPr>
+            <w:tcW w:w="8296" w:type="dxa"/>
+          </w:tcPr>
+          <w:p>
+            <w:pPr>
+              <w:autoSpaceDE w:val="0"/>
+              <w:autoSpaceDN w:val="0"/>
+              <w:adjustRightInd w:val="0"/>
+              <w:rPr>
+                <w:rFonts w:ascii="Consolas" w:hAnsi="Consolas" w:cs="Consolas"/>
+                <w:sz w:val="20"/>
+                <w:szCs w:val="20"/>
+              </w:rPr>
+            </w:pPr>
+            <w:proofErr w:type="spellStart"/>
+            <w:r>
+              <w:rPr>
+                <w:rFonts w:ascii="Consolas" w:hAnsi="Consolas" w:cs="Consolas"/>
+                <w:color w:val="0E00FF"/>
+                <w:sz w:val="20"/>
+                <w:szCs w:val="20"/>
+              </w:rPr>
+              <w:lastRenderedPageBreak/>
+              <w:t>function</w:t>
+            </w:r>
+            <w:proofErr w:type="spellEnd"/>
+            <w:r>
+              <w:rPr>
+                <w:rFonts w:ascii="Consolas" w:hAnsi="Consolas" w:cs="Consolas"/>
+                <w:color w:val="0E00FF"/>
+                <w:sz w:val="20"/>
+                <w:szCs w:val="20"/>
+              </w:rPr>
+              <w:t xml:space="preserve"> </w:t>
+            </w:r>
+            <w:r>
+              <w:rPr>
+                <w:rFonts w:ascii="Consolas" w:hAnsi="Consolas" w:cs="Consolas"/>
+                <w:color w:val="000000"/>
+                <w:sz w:val="20"/>
+                <w:szCs w:val="20"/>
+              </w:rPr>
+              <w:t>[</w:t>
+            </w:r>
+            <w:proofErr w:type="spellStart"/>
+            <w:r>
+              <w:rPr>
+                <w:rFonts w:ascii="Consolas" w:hAnsi="Consolas" w:cs="Consolas"/>
+                <w:color w:val="000000"/>
+                <w:sz w:val="20"/>
+                <w:szCs w:val="20"/>
+              </w:rPr>
+              <w:t>xmin</w:t>
+            </w:r>
+            <w:proofErr w:type="spellEnd"/>
+            <w:r>
+              <w:rPr>
+                <w:rFonts w:ascii="Consolas" w:hAnsi="Consolas" w:cs="Consolas"/>
+                <w:color w:val="000000"/>
+                <w:sz w:val="20"/>
+                <w:szCs w:val="20"/>
+              </w:rPr>
+              <w:t xml:space="preserve">, </w:t>
+            </w:r>
+            <w:proofErr w:type="spellStart"/>
+            <w:r>
+              <w:rPr>
+                <w:rFonts w:ascii="Consolas" w:hAnsi="Consolas" w:cs="Consolas"/>
+                <w:color w:val="000000"/>
+                <w:sz w:val="20"/>
+                <w:szCs w:val="20"/>
+              </w:rPr>
+              <w:t>fmin</w:t>
+            </w:r>
+            <w:proofErr w:type="spellEnd"/>
+            <w:r>
+              <w:rPr>
+                <w:rFonts w:ascii="Consolas" w:hAnsi="Consolas" w:cs="Consolas"/>
+                <w:color w:val="000000"/>
+                <w:sz w:val="20"/>
+                <w:szCs w:val="20"/>
+              </w:rPr>
+              <w:t xml:space="preserve">, </w:t>
+            </w:r>
+            <w:proofErr w:type="spellStart"/>
+            <w:r>
+              <w:rPr>
+                <w:rFonts w:ascii="Consolas" w:hAnsi="Consolas" w:cs="Consolas"/>
+                <w:color w:val="000000"/>
+                <w:sz w:val="20"/>
+                <w:szCs w:val="20"/>
+              </w:rPr>
+              <w:t>iter</w:t>
+            </w:r>
+            <w:proofErr w:type="spellEnd"/>
+            <w:r>
+              <w:rPr>
+                <w:rFonts w:ascii="Consolas" w:hAnsi="Consolas" w:cs="Consolas"/>
+                <w:color w:val="000000"/>
+                <w:sz w:val="20"/>
+                <w:szCs w:val="20"/>
+              </w:rPr>
+              <w:t xml:space="preserve">, tiempo] = </w:t>
+            </w:r>
+            <w:proofErr w:type="spellStart"/>
+            <w:r>
+              <w:rPr>
+                <w:rFonts w:ascii="Consolas" w:hAnsi="Consolas" w:cs="Consolas"/>
+                <w:color w:val="000000"/>
+                <w:sz w:val="20"/>
+                <w:szCs w:val="20"/>
+              </w:rPr>
+              <w:t>budi</w:t>
+            </w:r>
+            <w:proofErr w:type="spellEnd"/>
+            <w:r>
+              <w:rPr>
+                <w:rFonts w:ascii="Consolas" w:hAnsi="Consolas" w:cs="Consolas"/>
+                <w:color w:val="000000"/>
+                <w:sz w:val="20"/>
+                <w:szCs w:val="20"/>
+              </w:rPr>
+              <w:t>(f, a, b, tol, delta)</w:t>
+            </w:r>
+          </w:p>
+          <w:p>
+            <w:pPr>
+              <w:autoSpaceDE w:val="0"/>
+              <w:autoSpaceDN w:val="0"/>
+              <w:adjustRightInd w:val="0"/>
+              <w:rPr>
+                <w:rFonts w:ascii="Consolas" w:hAnsi="Consolas" w:cs="Consolas"/>
+                <w:sz w:val="20"/>
+                <w:szCs w:val="20"/>
+              </w:rPr>
+            </w:pPr>
+            <w:r>
+              <w:rPr>
+                <w:rFonts w:ascii="Consolas" w:hAnsi="Consolas" w:cs="Consolas"/>
+                <w:color w:val="008013"/>
+                <w:sz w:val="20"/>
+                <w:szCs w:val="20"/>
+              </w:rPr>
+              <w:t>%BUDI Método de búsqueda dicotómica</w:t>
+            </w:r>
+          </w:p>
+          <w:p>
+            <w:pPr>
+              <w:autoSpaceDE w:val="0"/>
+              <w:autoSpaceDN w:val="0"/>
+              <w:adjustRightInd w:val="0"/>
+              <w:rPr>
+                <w:rFonts w:ascii="Consolas" w:hAnsi="Consolas" w:cs="Consolas"/>
+                <w:sz w:val="20"/>
+                <w:szCs w:val="20"/>
+              </w:rPr>
+            </w:pPr>
+            <w:r>
+              <w:rPr>
+                <w:rFonts w:ascii="Consolas" w:hAnsi="Consolas" w:cs="Consolas"/>
+                <w:color w:val="008013"/>
+                <w:sz w:val="20"/>
+                <w:szCs w:val="20"/>
+              </w:rPr>
+              <w:t>%   Encuentra el mínimo local de f en el intervalo [</w:t>
+            </w:r>
+            <w:proofErr w:type="spellStart"/>
+            <w:r>
+              <w:rPr>
+                <w:rFonts w:ascii="Consolas" w:hAnsi="Consolas" w:cs="Consolas"/>
+                <w:color w:val="008013"/>
+                <w:sz w:val="20"/>
+                <w:szCs w:val="20"/>
+              </w:rPr>
+              <w:t>a,b</w:t>
+            </w:r>
+            <w:proofErr w:type="spellEnd"/>
+            <w:r>
+              <w:rPr>
+                <w:rFonts w:ascii="Consolas" w:hAnsi="Consolas" w:cs="Consolas"/>
+                <w:color w:val="008013"/>
+                <w:sz w:val="20"/>
+                <w:szCs w:val="20"/>
+              </w:rPr>
+              <w:t>]</w:t>
+            </w:r>
+          </w:p>
+          <w:p>
+            <w:pPr>
+              <w:autoSpaceDE w:val="0"/>
+              <w:autoSpaceDN w:val="0"/>
+              <w:adjustRightInd w:val="0"/>
+              <w:rPr>
+                <w:rFonts w:ascii="Consolas" w:hAnsi="Consolas" w:cs="Consolas"/>
+                <w:sz w:val="20"/>
+                <w:szCs w:val="20"/>
+              </w:rPr>
+            </w:pPr>
+            <w:r>
+              <w:rPr>
+                <w:rFonts w:ascii="Consolas" w:hAnsi="Consolas" w:cs="Consolas"/>
+                <w:color w:val="008013"/>
+                <w:sz w:val="20"/>
+                <w:szCs w:val="20"/>
+              </w:rPr>
+              <w:t>%   suponiendo que f es unimodal en dicho intervalo.</w:t>
+            </w:r>
+          </w:p>
+          <w:p>
+            <w:pPr>
+              <w:autoSpaceDE w:val="0"/>
+              <w:autoSpaceDN w:val="0"/>
+              <w:adjustRightInd w:val="0"/>
+              <w:rPr>
+                <w:rFonts w:ascii="Consolas" w:hAnsi="Consolas" w:cs="Consolas"/>
+                <w:sz w:val="20"/>
+                <w:szCs w:val="20"/>
+              </w:rPr>
+            </w:pPr>
+            <w:r>
+              <w:rPr>
+                <w:rFonts w:ascii="Consolas" w:hAnsi="Consolas" w:cs="Consolas"/>
+                <w:color w:val="008013"/>
+                <w:sz w:val="20"/>
+                <w:szCs w:val="20"/>
+              </w:rPr>
+              <w:t>%</w:t>
+            </w:r>
+          </w:p>
+          <w:p>
+            <w:pPr>
+              <w:autoSpaceDE w:val="0"/>
+              <w:autoSpaceDN w:val="0"/>
+              <w:adjustRightInd w:val="0"/>
+              <w:rPr>
+                <w:rFonts w:ascii="Consolas" w:hAnsi="Consolas" w:cs="Consolas"/>
+                <w:sz w:val="20"/>
+                <w:szCs w:val="20"/>
+              </w:rPr>
+            </w:pPr>
+            <w:r>
+              <w:rPr>
+                <w:rFonts w:ascii="Consolas" w:hAnsi="Consolas" w:cs="Consolas"/>
+                <w:color w:val="008013"/>
+                <w:sz w:val="20"/>
+                <w:szCs w:val="20"/>
+              </w:rPr>
+              <w:t>%   Entradas:</w:t>
+            </w:r>
+          </w:p>
+          <w:p>
+            <w:pPr>
+              <w:autoSpaceDE w:val="0"/>
+              <w:autoSpaceDN w:val="0"/>
+              <w:adjustRightInd w:val="0"/>
+              <w:rPr>
+                <w:rFonts w:ascii="Consolas" w:hAnsi="Consolas" w:cs="Consolas"/>
+                <w:sz w:val="20"/>
+                <w:szCs w:val="20"/>
+              </w:rPr>
+            </w:pPr>
+            <w:r>
+              <w:rPr>
+                <w:rFonts w:ascii="Consolas" w:hAnsi="Consolas" w:cs="Consolas"/>
+                <w:color w:val="008013"/>
+                <w:sz w:val="20"/>
+                <w:szCs w:val="20"/>
+              </w:rPr>
+              <w:t>%       f     -&gt; función</w:t>
+            </w:r>
+          </w:p>
+          <w:p>
+            <w:pPr>
+              <w:autoSpaceDE w:val="0"/>
+              <w:autoSpaceDN w:val="0"/>
+              <w:adjustRightInd w:val="0"/>
+              <w:rPr>
+                <w:rFonts w:ascii="Consolas" w:hAnsi="Consolas" w:cs="Consolas"/>
+                <w:sz w:val="20"/>
+                <w:szCs w:val="20"/>
+              </w:rPr>
+            </w:pPr>
+            <w:r>
+              <w:rPr>
+                <w:rFonts w:ascii="Consolas" w:hAnsi="Consolas" w:cs="Consolas"/>
+                <w:color w:val="008013"/>
+                <w:sz w:val="20"/>
+                <w:szCs w:val="20"/>
+              </w:rPr>
+              <w:t xml:space="preserve">%       a, </w:t>
+            </w:r>
+            <w:proofErr w:type="gramStart"/>
+            <w:r>
+              <w:rPr>
+                <w:rFonts w:ascii="Consolas" w:hAnsi="Consolas" w:cs="Consolas"/>
+                <w:color w:val="008013"/>
+                <w:sz w:val="20"/>
+                <w:szCs w:val="20"/>
+              </w:rPr>
+              <w:t>b  -</w:t>
+            </w:r>
+            <w:proofErr w:type="gramEnd"/>
+            <w:r>
+              <w:rPr>
+                <w:rFonts w:ascii="Consolas" w:hAnsi="Consolas" w:cs="Consolas"/>
+                <w:color w:val="008013"/>
+                <w:sz w:val="20"/>
+                <w:szCs w:val="20"/>
+              </w:rPr>
+              <w:t>&gt; extremos del intervalo (unimodal)</w:t>
+            </w:r>
+          </w:p>
+          <w:p>
+            <w:pPr>
+              <w:autoSpaceDE w:val="0"/>
+              <w:autoSpaceDN w:val="0"/>
+              <w:adjustRightInd w:val="0"/>
+              <w:rPr>
+                <w:rFonts w:ascii="Consolas" w:hAnsi="Consolas" w:cs="Consolas"/>
+                <w:sz w:val="20"/>
+                <w:szCs w:val="20"/>
+              </w:rPr>
+            </w:pPr>
+            <w:r>
+              <w:rPr>
+                <w:rFonts w:ascii="Consolas" w:hAnsi="Consolas" w:cs="Consolas"/>
+                <w:color w:val="008013"/>
+                <w:sz w:val="20"/>
+                <w:szCs w:val="20"/>
+              </w:rPr>
+              <w:t>%       tol   -&gt; tolerancia</w:t>
+            </w:r>
+          </w:p>
+          <w:p>
+            <w:pPr>
+              <w:autoSpaceDE w:val="0"/>
+              <w:autoSpaceDN w:val="0"/>
+              <w:adjustRightInd w:val="0"/>
+              <w:rPr>
+                <w:rFonts w:ascii="Consolas" w:hAnsi="Consolas" w:cs="Consolas"/>
+                <w:sz w:val="20"/>
+                <w:szCs w:val="20"/>
+              </w:rPr>
+            </w:pPr>
+            <w:r>
+              <w:rPr>
+                <w:rFonts w:ascii="Consolas" w:hAnsi="Consolas" w:cs="Consolas"/>
+                <w:color w:val="008013"/>
+                <w:sz w:val="20"/>
+                <w:szCs w:val="20"/>
+              </w:rPr>
+              <w:t>%       delta -&gt; pequeño desplazamiento</w:t>
+            </w:r>
+          </w:p>
+          <w:p>
+            <w:pPr>
+              <w:autoSpaceDE w:val="0"/>
+              <w:autoSpaceDN w:val="0"/>
+              <w:adjustRightInd w:val="0"/>
+              <w:rPr>
+                <w:rFonts w:ascii="Consolas" w:hAnsi="Consolas" w:cs="Consolas"/>
+                <w:sz w:val="20"/>
+                <w:szCs w:val="20"/>
+              </w:rPr>
+            </w:pPr>
+            <w:r>
+              <w:rPr>
+                <w:rFonts w:ascii="Consolas" w:hAnsi="Consolas" w:cs="Consolas"/>
+                <w:color w:val="008013"/>
+                <w:sz w:val="20"/>
+                <w:szCs w:val="20"/>
+              </w:rPr>
+              <w:t>%</w:t>
+            </w:r>
+          </w:p>
+          <w:p>
+            <w:pPr>
+              <w:autoSpaceDE w:val="0"/>
+              <w:autoSpaceDN w:val="0"/>
+              <w:adjustRightInd w:val="0"/>
+              <w:rPr>
+                <w:rFonts w:ascii="Consolas" w:hAnsi="Consolas" w:cs="Consolas"/>
+                <w:sz w:val="20"/>
+                <w:szCs w:val="20"/>
+              </w:rPr>
+            </w:pPr>
+            <w:r>
+              <w:rPr>
+                <w:rFonts w:ascii="Consolas" w:hAnsi="Consolas" w:cs="Consolas"/>
+                <w:color w:val="008013"/>
+                <w:sz w:val="20"/>
+                <w:szCs w:val="20"/>
+              </w:rPr>
+              <w:t>%   Salidas:</w:t>
+            </w:r>
+          </w:p>
+          <w:p>
+            <w:pPr>
+              <w:autoSpaceDE w:val="0"/>
+              <w:autoSpaceDN w:val="0"/>
+              <w:adjustRightInd w:val="0"/>
+              <w:rPr>
+                <w:rFonts w:ascii="Consolas" w:hAnsi="Consolas" w:cs="Consolas"/>
+                <w:sz w:val="20"/>
+                <w:szCs w:val="20"/>
+              </w:rPr>
+            </w:pPr>
+            <w:r>
+              <w:rPr>
+                <w:rFonts w:ascii="Consolas" w:hAnsi="Consolas" w:cs="Consolas"/>
+                <w:color w:val="008013"/>
+                <w:sz w:val="20"/>
+                <w:szCs w:val="20"/>
+              </w:rPr>
+              <w:t xml:space="preserve">%       </w:t>
+            </w:r>
+            <w:proofErr w:type="spellStart"/>
+            <w:r>
+              <w:rPr>
+                <w:rFonts w:ascii="Consolas" w:hAnsi="Consolas" w:cs="Consolas"/>
+                <w:color w:val="008013"/>
+                <w:sz w:val="20"/>
+                <w:szCs w:val="20"/>
+              </w:rPr>
+              <w:t>xmin</w:t>
+            </w:r>
+            <w:proofErr w:type="spellEnd"/>
+            <w:r>
+              <w:rPr>
+                <w:rFonts w:ascii="Consolas" w:hAnsi="Consolas" w:cs="Consolas"/>
+                <w:color w:val="008013"/>
+                <w:sz w:val="20"/>
+                <w:szCs w:val="20"/>
+              </w:rPr>
+              <w:t xml:space="preserve">   -&gt; aproximación del mínimo</w:t>
+            </w:r>
+          </w:p>
+          <w:p>
+            <w:pPr>
+              <w:autoSpaceDE w:val="0"/>
+              <w:autoSpaceDN w:val="0"/>
+              <w:adjustRightInd w:val="0"/>
+              <w:rPr>
+                <w:rFonts w:ascii="Consolas" w:hAnsi="Consolas" w:cs="Consolas"/>
+                <w:sz w:val="20"/>
+                <w:szCs w:val="20"/>
+              </w:rPr>
+            </w:pPr>
+            <w:r>
+              <w:rPr>
+                <w:rFonts w:ascii="Consolas" w:hAnsi="Consolas" w:cs="Consolas"/>
+                <w:color w:val="008013"/>
+                <w:sz w:val="20"/>
+                <w:szCs w:val="20"/>
+              </w:rPr>
+              <w:t xml:space="preserve">%       </w:t>
+            </w:r>
+            <w:proofErr w:type="spellStart"/>
+            <w:r>
+              <w:rPr>
+                <w:rFonts w:ascii="Consolas" w:hAnsi="Consolas" w:cs="Consolas"/>
+                <w:color w:val="008013"/>
+                <w:sz w:val="20"/>
+                <w:szCs w:val="20"/>
+              </w:rPr>
+              <w:t>fmin</w:t>
+            </w:r>
+            <w:proofErr w:type="spellEnd"/>
+            <w:r>
+              <w:rPr>
+                <w:rFonts w:ascii="Consolas" w:hAnsi="Consolas" w:cs="Consolas"/>
+                <w:color w:val="008013"/>
+                <w:sz w:val="20"/>
+                <w:szCs w:val="20"/>
+              </w:rPr>
+              <w:t xml:space="preserve">   -&gt; valor de la función en </w:t>
+            </w:r>
+            <w:proofErr w:type="spellStart"/>
+            <w:r>
+              <w:rPr>
+                <w:rFonts w:ascii="Consolas" w:hAnsi="Consolas" w:cs="Consolas"/>
+                <w:color w:val="008013"/>
+                <w:sz w:val="20"/>
+                <w:szCs w:val="20"/>
+              </w:rPr>
+              <w:t>xmin</w:t>
+            </w:r>
+            <w:proofErr w:type="spellEnd"/>
+          </w:p>
+          <w:p>
+            <w:pPr>
+              <w:autoSpaceDE w:val="0"/>
+              <w:autoSpaceDN w:val="0"/>
+              <w:adjustRightInd w:val="0"/>
+              <w:rPr>
+                <w:rFonts w:ascii="Consolas" w:hAnsi="Consolas" w:cs="Consolas"/>
+                <w:sz w:val="20"/>
+                <w:szCs w:val="20"/>
+              </w:rPr>
+            </w:pPr>
+            <w:r>
+              <w:rPr>
+                <w:rFonts w:ascii="Consolas" w:hAnsi="Consolas" w:cs="Consolas"/>
+                <w:color w:val="008013"/>
+                <w:sz w:val="20"/>
+                <w:szCs w:val="20"/>
+              </w:rPr>
+              <w:t xml:space="preserve">%       </w:t>
+            </w:r>
+            <w:proofErr w:type="spellStart"/>
+            <w:r>
+              <w:rPr>
+                <w:rFonts w:ascii="Consolas" w:hAnsi="Consolas" w:cs="Consolas"/>
+                <w:color w:val="008013"/>
+                <w:sz w:val="20"/>
+                <w:szCs w:val="20"/>
+              </w:rPr>
+              <w:t>iter</w:t>
+            </w:r>
+            <w:proofErr w:type="spellEnd"/>
+            <w:r>
+              <w:rPr>
+                <w:rFonts w:ascii="Consolas" w:hAnsi="Consolas" w:cs="Consolas"/>
+                <w:color w:val="008013"/>
+                <w:sz w:val="20"/>
+                <w:szCs w:val="20"/>
+              </w:rPr>
+              <w:t xml:space="preserve">   -&gt; número de iteraciones</w:t>
+            </w:r>
+          </w:p>
+          <w:p>
+            <w:pPr>
+              <w:autoSpaceDE w:val="0"/>
+              <w:autoSpaceDN w:val="0"/>
+              <w:adjustRightInd w:val="0"/>
+              <w:rPr>
+                <w:rFonts w:ascii="Consolas" w:hAnsi="Consolas" w:cs="Consolas"/>
+                <w:sz w:val="20"/>
+                <w:szCs w:val="20"/>
+              </w:rPr>
+            </w:pPr>
+            <w:r>
+              <w:rPr>
+                <w:rFonts w:ascii="Consolas" w:hAnsi="Consolas" w:cs="Consolas"/>
+                <w:color w:val="008013"/>
+                <w:sz w:val="20"/>
+                <w:szCs w:val="20"/>
+              </w:rPr>
+              <w:t>%       tiempo -&gt; tiempo de ejecución</w:t>
+            </w:r>
+          </w:p>
+          <w:p>
+            <w:pPr>
+              <w:autoSpaceDE w:val="0"/>
+              <w:autoSpaceDN w:val="0"/>
+              <w:adjustRightInd w:val="0"/>
+              <w:rPr>
+                <w:rFonts w:ascii="Consolas" w:hAnsi="Consolas" w:cs="Consolas"/>
+                <w:sz w:val="20"/>
+                <w:szCs w:val="20"/>
+              </w:rPr>
+            </w:pPr>
+          </w:p>
+          <w:p>
+            <w:pPr>
+              <w:autoSpaceDE w:val="0"/>
+              <w:autoSpaceDN w:val="0"/>
+              <w:adjustRightInd w:val="0"/>
+              <w:rPr>
+                <w:rFonts w:ascii="Consolas" w:hAnsi="Consolas" w:cs="Consolas"/>
+                <w:sz w:val="20"/>
+                <w:szCs w:val="20"/>
+              </w:rPr>
+            </w:pPr>
+            <w:r>
+              <w:rPr>
+                <w:rFonts w:ascii="Consolas" w:hAnsi="Consolas" w:cs="Consolas"/>
+                <w:color w:val="008013"/>
+                <w:sz w:val="20"/>
+                <w:szCs w:val="20"/>
+              </w:rPr>
+              <w:t>% ---------------- INICIALIZACIÓN ----------------</w:t>
+            </w:r>
+          </w:p>
+          <w:p>
+            <w:pPr>
+              <w:autoSpaceDE w:val="0"/>
+              <w:autoSpaceDN w:val="0"/>
+              <w:adjustRightInd w:val="0"/>
+              <w:rPr>
+                <w:rFonts w:ascii="Consolas" w:hAnsi="Consolas" w:cs="Consolas"/>
+                <w:sz w:val="20"/>
+                <w:szCs w:val="20"/>
+              </w:rPr>
+            </w:pPr>
+            <w:r>
+              <w:rPr>
+                <w:rFonts w:ascii="Consolas" w:hAnsi="Consolas" w:cs="Consolas"/>
+                <w:color w:val="000000"/>
+                <w:sz w:val="20"/>
+                <w:szCs w:val="20"/>
+              </w:rPr>
+              <w:t>tic;</w:t>
+            </w:r>
+          </w:p>
+          <w:p>
+            <w:pPr>
+              <w:autoSpaceDE w:val="0"/>
+              <w:autoSpaceDN w:val="0"/>
+              <w:adjustRightInd w:val="0"/>
+              <w:rPr>
+                <w:rFonts w:ascii="Consolas" w:hAnsi="Consolas" w:cs="Consolas"/>
+                <w:sz w:val="20"/>
+                <w:szCs w:val="20"/>
+              </w:rPr>
+            </w:pPr>
+            <w:proofErr w:type="spellStart"/>
+            <w:r>
+              <w:rPr>
+                <w:rFonts w:ascii="Consolas" w:hAnsi="Consolas" w:cs="Consolas"/>
+                <w:color w:val="000000"/>
+                <w:sz w:val="20"/>
+                <w:szCs w:val="20"/>
+              </w:rPr>
+              <w:t>iter</w:t>
+            </w:r>
+            <w:proofErr w:type="spellEnd"/>
+            <w:r>
+              <w:rPr>
+                <w:rFonts w:ascii="Consolas" w:hAnsi="Consolas" w:cs="Consolas"/>
+                <w:color w:val="000000"/>
+                <w:sz w:val="20"/>
+                <w:szCs w:val="20"/>
+              </w:rPr>
+              <w:t xml:space="preserve"> = 0;</w:t>
+            </w:r>
+          </w:p>
+          <w:p>
+            <w:pPr>
+              <w:autoSpaceDE w:val="0"/>
+              <w:autoSpaceDN w:val="0"/>
+              <w:adjustRightInd w:val="0"/>
+              <w:rPr>
+                <w:rFonts w:ascii="Consolas" w:hAnsi="Consolas" w:cs="Consolas"/>
+                <w:sz w:val="20"/>
+                <w:szCs w:val="20"/>
+              </w:rPr>
+            </w:pPr>
+            <w:proofErr w:type="spellStart"/>
+            <w:r>
+              <w:rPr>
+                <w:rFonts w:ascii="Consolas" w:hAnsi="Consolas" w:cs="Consolas"/>
+                <w:color w:val="000000"/>
+                <w:sz w:val="20"/>
+                <w:szCs w:val="20"/>
+              </w:rPr>
+              <w:t>maxIter</w:t>
+            </w:r>
+            <w:proofErr w:type="spellEnd"/>
+            <w:r>
+              <w:rPr>
+                <w:rFonts w:ascii="Consolas" w:hAnsi="Consolas" w:cs="Consolas"/>
+                <w:color w:val="000000"/>
+                <w:sz w:val="20"/>
+                <w:szCs w:val="20"/>
+              </w:rPr>
+              <w:t xml:space="preserve"> = 10</w:t>
+            </w:r>
+            <w:r>
+              <w:rPr>
+                <w:rFonts w:ascii="Consolas" w:hAnsi="Consolas" w:cs="Consolas"/>
+                <w:color w:val="000000"/>
+                <w:sz w:val="20"/>
+                <w:szCs w:val="20"/>
+              </w:rPr>
+              <w:t>0</w:t>
+            </w:r>
+            <w:r>
+              <w:rPr>
+                <w:rFonts w:ascii="Consolas" w:hAnsi="Consolas" w:cs="Consolas"/>
+                <w:color w:val="000000"/>
+                <w:sz w:val="20"/>
+                <w:szCs w:val="20"/>
+              </w:rPr>
+              <w:t xml:space="preserve">00;   </w:t>
+            </w:r>
+            <w:r>
+              <w:rPr>
+                <w:rFonts w:ascii="Consolas" w:hAnsi="Consolas" w:cs="Consolas"/>
+                <w:color w:val="008013"/>
+                <w:sz w:val="20"/>
+                <w:szCs w:val="20"/>
+              </w:rPr>
+              <w:t>% Por seguridad, para que no esté realizando iteraciones infinitas</w:t>
+            </w:r>
+          </w:p>
+          <w:p>
+            <w:pPr>
+              <w:autoSpaceDE w:val="0"/>
+              <w:autoSpaceDN w:val="0"/>
+              <w:adjustRightInd w:val="0"/>
+              <w:rPr>
+                <w:rFonts w:ascii="Consolas" w:hAnsi="Consolas" w:cs="Consolas"/>
+                <w:sz w:val="20"/>
+                <w:szCs w:val="20"/>
+              </w:rPr>
+            </w:pPr>
+          </w:p>
+          <w:p>
+            <w:pPr>
+              <w:autoSpaceDE w:val="0"/>
+              <w:autoSpaceDN w:val="0"/>
+              <w:adjustRightInd w:val="0"/>
+              <w:rPr>
+                <w:rFonts w:ascii="Consolas" w:hAnsi="Consolas" w:cs="Consolas"/>
+                <w:sz w:val="20"/>
+                <w:szCs w:val="20"/>
+              </w:rPr>
+            </w:pPr>
+            <w:r>
+              <w:rPr>
+                <w:rFonts w:ascii="Consolas" w:hAnsi="Consolas" w:cs="Consolas"/>
+                <w:color w:val="008013"/>
+                <w:sz w:val="20"/>
+                <w:szCs w:val="20"/>
+              </w:rPr>
+              <w:t>% ---------------- BUCLE PRINCIPAL ----------------</w:t>
+            </w:r>
+          </w:p>
+          <w:p>
+            <w:pPr>
+              <w:autoSpaceDE w:val="0"/>
+              <w:autoSpaceDN w:val="0"/>
+              <w:adjustRightInd w:val="0"/>
+              <w:rPr>
+                <w:rFonts w:ascii="Consolas" w:hAnsi="Consolas" w:cs="Consolas"/>
+                <w:sz w:val="20"/>
+                <w:szCs w:val="20"/>
+              </w:rPr>
+            </w:pPr>
+            <w:proofErr w:type="spellStart"/>
+            <w:r>
+              <w:rPr>
+                <w:rFonts w:ascii="Consolas" w:hAnsi="Consolas" w:cs="Consolas"/>
+                <w:color w:val="0E00FF"/>
+                <w:sz w:val="20"/>
+                <w:szCs w:val="20"/>
+              </w:rPr>
+              <w:t>while</w:t>
+            </w:r>
+            <w:proofErr w:type="spellEnd"/>
+            <w:r>
+              <w:rPr>
+                <w:rFonts w:ascii="Consolas" w:hAnsi="Consolas" w:cs="Consolas"/>
+                <w:color w:val="0E00FF"/>
+                <w:sz w:val="20"/>
+                <w:szCs w:val="20"/>
+              </w:rPr>
+              <w:t xml:space="preserve"> </w:t>
+            </w:r>
+            <w:r>
+              <w:rPr>
+                <w:rFonts w:ascii="Consolas" w:hAnsi="Consolas" w:cs="Consolas"/>
+                <w:color w:val="000000"/>
+                <w:sz w:val="20"/>
+                <w:szCs w:val="20"/>
+              </w:rPr>
+              <w:t xml:space="preserve">(b - a) &gt; tol &amp;&amp; </w:t>
+            </w:r>
+            <w:proofErr w:type="spellStart"/>
+            <w:r>
+              <w:rPr>
+                <w:rFonts w:ascii="Consolas" w:hAnsi="Consolas" w:cs="Consolas"/>
+                <w:color w:val="000000"/>
+                <w:sz w:val="20"/>
+                <w:szCs w:val="20"/>
+              </w:rPr>
+              <w:t>iter</w:t>
+            </w:r>
+            <w:proofErr w:type="spellEnd"/>
+            <w:r>
+              <w:rPr>
+                <w:rFonts w:ascii="Consolas" w:hAnsi="Consolas" w:cs="Consolas"/>
+                <w:color w:val="000000"/>
+                <w:sz w:val="20"/>
+                <w:szCs w:val="20"/>
+              </w:rPr>
+              <w:t xml:space="preserve"> &lt; </w:t>
+            </w:r>
+            <w:proofErr w:type="spellStart"/>
+            <w:r>
+              <w:rPr>
+                <w:rFonts w:ascii="Consolas" w:hAnsi="Consolas" w:cs="Consolas"/>
+                <w:color w:val="000000"/>
+                <w:sz w:val="20"/>
+                <w:szCs w:val="20"/>
+              </w:rPr>
+              <w:t>maxIter</w:t>
+            </w:r>
+            <w:proofErr w:type="spellEnd"/>
+          </w:p>
+          <w:p>
+            <w:pPr>
+              <w:autoSpaceDE w:val="0"/>
+              <w:autoSpaceDN w:val="0"/>
+              <w:adjustRightInd w:val="0"/>
+              <w:rPr>
+                <w:rFonts w:ascii="Consolas" w:hAnsi="Consolas" w:cs="Consolas"/>
+                <w:sz w:val="20"/>
+                <w:szCs w:val="20"/>
+              </w:rPr>
+            </w:pPr>
+            <w:r>
+              <w:rPr>
+                <w:rFonts w:ascii="Consolas" w:hAnsi="Consolas" w:cs="Consolas"/>
+                <w:color w:val="000000"/>
+                <w:sz w:val="20"/>
+                <w:szCs w:val="20"/>
+              </w:rPr>
+              <w:t xml:space="preserve">    </w:t>
+            </w:r>
+          </w:p>
+          <w:p>
+            <w:pPr>
+              <w:autoSpaceDE w:val="0"/>
+              <w:autoSpaceDN w:val="0"/>
+              <w:adjustRightInd w:val="0"/>
+              <w:rPr>
+                <w:rFonts w:ascii="Consolas" w:hAnsi="Consolas" w:cs="Consolas"/>
+                <w:sz w:val="20"/>
+                <w:szCs w:val="20"/>
+              </w:rPr>
+            </w:pPr>
+            <w:r>
+              <w:rPr>
+                <w:rFonts w:ascii="Consolas" w:hAnsi="Consolas" w:cs="Consolas"/>
+                <w:color w:val="000000"/>
+                <w:sz w:val="20"/>
+                <w:szCs w:val="20"/>
+              </w:rPr>
+              <w:t xml:space="preserve">    m = (a + b)/2;</w:t>
+            </w:r>
+          </w:p>
+          <w:p>
+            <w:pPr>
+              <w:autoSpaceDE w:val="0"/>
+              <w:autoSpaceDN w:val="0"/>
+              <w:adjustRightInd w:val="0"/>
+              <w:rPr>
+                <w:rFonts w:ascii="Consolas" w:hAnsi="Consolas" w:cs="Consolas"/>
+                <w:sz w:val="20"/>
+                <w:szCs w:val="20"/>
+              </w:rPr>
+            </w:pPr>
+            <w:r>
+              <w:rPr>
+                <w:rFonts w:ascii="Consolas" w:hAnsi="Consolas" w:cs="Consolas"/>
+                <w:color w:val="000000"/>
+                <w:sz w:val="20"/>
+                <w:szCs w:val="20"/>
+              </w:rPr>
+              <w:t xml:space="preserve">    </w:t>
+            </w:r>
+          </w:p>
+          <w:p>
+            <w:pPr>
+              <w:autoSpaceDE w:val="0"/>
+              <w:autoSpaceDN w:val="0"/>
+              <w:adjustRightInd w:val="0"/>
+              <w:rPr>
+                <w:rFonts w:ascii="Consolas" w:hAnsi="Consolas" w:cs="Consolas"/>
+                <w:sz w:val="20"/>
+                <w:szCs w:val="20"/>
+              </w:rPr>
+            </w:pPr>
+            <w:r>
+              <w:rPr>
+                <w:rFonts w:ascii="Consolas" w:hAnsi="Consolas" w:cs="Consolas"/>
+                <w:color w:val="000000"/>
+                <w:sz w:val="20"/>
+                <w:szCs w:val="20"/>
+              </w:rPr>
+              <w:t xml:space="preserve">    x1 = m - delta;</w:t>
+            </w:r>
+          </w:p>
+          <w:p>
+            <w:pPr>
+              <w:autoSpaceDE w:val="0"/>
+              <w:autoSpaceDN w:val="0"/>
+              <w:adjustRightInd w:val="0"/>
+              <w:rPr>
+                <w:rFonts w:ascii="Consolas" w:hAnsi="Consolas" w:cs="Consolas"/>
+                <w:sz w:val="20"/>
+                <w:szCs w:val="20"/>
+              </w:rPr>
+            </w:pPr>
+            <w:r>
+              <w:rPr>
+                <w:rFonts w:ascii="Consolas" w:hAnsi="Consolas" w:cs="Consolas"/>
+                <w:color w:val="000000"/>
+                <w:sz w:val="20"/>
+                <w:szCs w:val="20"/>
+              </w:rPr>
+              <w:t xml:space="preserve">    x2 = m + delta;</w:t>
+            </w:r>
+          </w:p>
+          <w:p>
+            <w:pPr>
+              <w:autoSpaceDE w:val="0"/>
+              <w:autoSpaceDN w:val="0"/>
+              <w:adjustRightInd w:val="0"/>
+              <w:rPr>
+                <w:rFonts w:ascii="Consolas" w:hAnsi="Consolas" w:cs="Consolas"/>
+                <w:sz w:val="20"/>
+                <w:szCs w:val="20"/>
+              </w:rPr>
+            </w:pPr>
+            <w:r>
+              <w:rPr>
+                <w:rFonts w:ascii="Consolas" w:hAnsi="Consolas" w:cs="Consolas"/>
+                <w:color w:val="000000"/>
+                <w:sz w:val="20"/>
+                <w:szCs w:val="20"/>
+              </w:rPr>
+              <w:t xml:space="preserve">    </w:t>
+            </w:r>
+          </w:p>
+          <w:p>
+            <w:pPr>
+              <w:autoSpaceDE w:val="0"/>
+              <w:autoSpaceDN w:val="0"/>
+              <w:adjustRightInd w:val="0"/>
+              <w:rPr>
+                <w:rFonts w:ascii="Consolas" w:hAnsi="Consolas" w:cs="Consolas"/>
+                <w:sz w:val="20"/>
+                <w:szCs w:val="20"/>
+              </w:rPr>
+            </w:pPr>
+            <w:r>
+              <w:rPr>
+                <w:rFonts w:ascii="Consolas" w:hAnsi="Consolas" w:cs="Consolas"/>
+                <w:color w:val="000000"/>
+                <w:sz w:val="20"/>
+                <w:szCs w:val="20"/>
+              </w:rPr>
+              <w:t xml:space="preserve">    </w:t>
+            </w:r>
+            <w:r>
+              <w:rPr>
+                <w:rFonts w:ascii="Consolas" w:hAnsi="Consolas" w:cs="Consolas"/>
+                <w:color w:val="008013"/>
+                <w:sz w:val="20"/>
+                <w:szCs w:val="20"/>
+              </w:rPr>
+              <w:t>% Evaluaciones de la función en los extremos del intervalo</w:t>
+            </w:r>
+          </w:p>
+          <w:p>
+            <w:pPr>
+              <w:autoSpaceDE w:val="0"/>
+              <w:autoSpaceDN w:val="0"/>
+              <w:adjustRightInd w:val="0"/>
+              <w:rPr>
+                <w:rFonts w:ascii="Consolas" w:hAnsi="Consolas" w:cs="Consolas"/>
+                <w:sz w:val="20"/>
+                <w:szCs w:val="20"/>
+              </w:rPr>
+            </w:pPr>
+            <w:r>
+              <w:rPr>
+                <w:rFonts w:ascii="Consolas" w:hAnsi="Consolas" w:cs="Consolas"/>
+                <w:color w:val="000000"/>
+                <w:sz w:val="20"/>
+                <w:szCs w:val="20"/>
+              </w:rPr>
+              <w:t xml:space="preserve">    f1 = f(x1);</w:t>
+            </w:r>
+          </w:p>
+          <w:p>
+            <w:pPr>
+              <w:autoSpaceDE w:val="0"/>
+              <w:autoSpaceDN w:val="0"/>
+              <w:adjustRightInd w:val="0"/>
+              <w:rPr>
+                <w:rFonts w:ascii="Consolas" w:hAnsi="Consolas" w:cs="Consolas"/>
+                <w:sz w:val="20"/>
+                <w:szCs w:val="20"/>
+              </w:rPr>
+            </w:pPr>
+            <w:r>
+              <w:rPr>
+                <w:rFonts w:ascii="Consolas" w:hAnsi="Consolas" w:cs="Consolas"/>
+                <w:color w:val="000000"/>
+                <w:sz w:val="20"/>
+                <w:szCs w:val="20"/>
+              </w:rPr>
+              <w:t xml:space="preserve">    f2 = f(x2);</w:t>
+            </w:r>
+          </w:p>
+          <w:p>
+            <w:pPr>
+              <w:autoSpaceDE w:val="0"/>
+              <w:autoSpaceDN w:val="0"/>
+              <w:adjustRightInd w:val="0"/>
+              <w:rPr>
+                <w:rFonts w:ascii="Consolas" w:hAnsi="Consolas" w:cs="Consolas"/>
+                <w:sz w:val="20"/>
+                <w:szCs w:val="20"/>
+              </w:rPr>
+            </w:pPr>
+            <w:r>
+              <w:rPr>
+                <w:rFonts w:ascii="Consolas" w:hAnsi="Consolas" w:cs="Consolas"/>
+                <w:color w:val="000000"/>
+                <w:sz w:val="20"/>
+                <w:szCs w:val="20"/>
+              </w:rPr>
+              <w:t xml:space="preserve">    </w:t>
+            </w:r>
+          </w:p>
+          <w:p>
+            <w:pPr>
+              <w:autoSpaceDE w:val="0"/>
+              <w:autoSpaceDN w:val="0"/>
+              <w:adjustRightInd w:val="0"/>
+              <w:rPr>
+                <w:rFonts w:ascii="Consolas" w:hAnsi="Consolas" w:cs="Consolas"/>
+                <w:sz w:val="20"/>
+                <w:szCs w:val="20"/>
+              </w:rPr>
+            </w:pPr>
+            <w:r>
+              <w:rPr>
+                <w:rFonts w:ascii="Consolas" w:hAnsi="Consolas" w:cs="Consolas"/>
+                <w:color w:val="000000"/>
+                <w:sz w:val="20"/>
+                <w:szCs w:val="20"/>
+              </w:rPr>
+              <w:t xml:space="preserve">    </w:t>
+            </w:r>
+            <w:r>
+              <w:rPr>
+                <w:rFonts w:ascii="Consolas" w:hAnsi="Consolas" w:cs="Consolas"/>
+                <w:color w:val="008013"/>
+                <w:sz w:val="20"/>
+                <w:szCs w:val="20"/>
+              </w:rPr>
+              <w:t>% Modificación del intervalo</w:t>
+            </w:r>
+          </w:p>
+          <w:p>
+            <w:pPr>
+              <w:autoSpaceDE w:val="0"/>
+              <w:autoSpaceDN w:val="0"/>
+              <w:adjustRightInd w:val="0"/>
+              <w:rPr>
+                <w:rFonts w:ascii="Consolas" w:hAnsi="Consolas" w:cs="Consolas"/>
+                <w:sz w:val="20"/>
+                <w:szCs w:val="20"/>
+              </w:rPr>
+            </w:pPr>
+            <w:r>
+              <w:rPr>
+                <w:rFonts w:ascii="Consolas" w:hAnsi="Consolas" w:cs="Consolas"/>
+                <w:color w:val="000000"/>
+                <w:sz w:val="20"/>
+                <w:szCs w:val="20"/>
+              </w:rPr>
+              <w:t xml:space="preserve">    </w:t>
+            </w:r>
+            <w:proofErr w:type="spellStart"/>
+            <w:r>
+              <w:rPr>
+                <w:rFonts w:ascii="Consolas" w:hAnsi="Consolas" w:cs="Consolas"/>
+                <w:color w:val="0E00FF"/>
+                <w:sz w:val="20"/>
+                <w:szCs w:val="20"/>
+              </w:rPr>
+              <w:t>if</w:t>
+            </w:r>
+            <w:proofErr w:type="spellEnd"/>
+            <w:r>
+              <w:rPr>
+                <w:rFonts w:ascii="Consolas" w:hAnsi="Consolas" w:cs="Consolas"/>
+                <w:color w:val="0E00FF"/>
+                <w:sz w:val="20"/>
+                <w:szCs w:val="20"/>
+              </w:rPr>
+              <w:t xml:space="preserve"> </w:t>
+            </w:r>
+            <w:r>
+              <w:rPr>
+                <w:rFonts w:ascii="Consolas" w:hAnsi="Consolas" w:cs="Consolas"/>
+                <w:color w:val="000000"/>
+                <w:sz w:val="20"/>
+                <w:szCs w:val="20"/>
+              </w:rPr>
+              <w:t>f1 &lt; f2</w:t>
+            </w:r>
+          </w:p>
+          <w:p>
+            <w:pPr>
+              <w:autoSpaceDE w:val="0"/>
+              <w:autoSpaceDN w:val="0"/>
+              <w:adjustRightInd w:val="0"/>
+              <w:rPr>
+                <w:rFonts w:ascii="Consolas" w:hAnsi="Consolas" w:cs="Consolas"/>
+                <w:sz w:val="20"/>
+                <w:szCs w:val="20"/>
+              </w:rPr>
+            </w:pPr>
+            <w:r>
+              <w:rPr>
+                <w:rFonts w:ascii="Consolas" w:hAnsi="Consolas" w:cs="Consolas"/>
+                <w:color w:val="000000"/>
+                <w:sz w:val="20"/>
+                <w:szCs w:val="20"/>
+              </w:rPr>
+              <w:t xml:space="preserve">        b = x2;</w:t>
+            </w:r>
+          </w:p>
+          <w:p>
+            <w:pPr>
+              <w:autoSpaceDE w:val="0"/>
+              <w:autoSpaceDN w:val="0"/>
+              <w:adjustRightInd w:val="0"/>
+              <w:rPr>
+                <w:rFonts w:ascii="Consolas" w:hAnsi="Consolas" w:cs="Consolas"/>
+                <w:sz w:val="20"/>
+                <w:szCs w:val="20"/>
+              </w:rPr>
+            </w:pPr>
+            <w:r>
+              <w:rPr>
+                <w:rFonts w:ascii="Consolas" w:hAnsi="Consolas" w:cs="Consolas"/>
+                <w:color w:val="000000"/>
+                <w:sz w:val="20"/>
+                <w:szCs w:val="20"/>
+              </w:rPr>
+              <w:t xml:space="preserve">    </w:t>
+            </w:r>
+            <w:proofErr w:type="spellStart"/>
+            <w:r>
+              <w:rPr>
+                <w:rFonts w:ascii="Consolas" w:hAnsi="Consolas" w:cs="Consolas"/>
+                <w:color w:val="0E00FF"/>
+                <w:sz w:val="20"/>
+                <w:szCs w:val="20"/>
+              </w:rPr>
+              <w:t>else</w:t>
+            </w:r>
+            <w:proofErr w:type="spellEnd"/>
+          </w:p>
+          <w:p>
+            <w:pPr>
+              <w:autoSpaceDE w:val="0"/>
+              <w:autoSpaceDN w:val="0"/>
+              <w:adjustRightInd w:val="0"/>
+              <w:rPr>
+                <w:rFonts w:ascii="Consolas" w:hAnsi="Consolas" w:cs="Consolas"/>
+                <w:sz w:val="20"/>
+                <w:szCs w:val="20"/>
+              </w:rPr>
+            </w:pPr>
+            <w:r>
+              <w:rPr>
+                <w:rFonts w:ascii="Consolas" w:hAnsi="Consolas" w:cs="Consolas"/>
+                <w:color w:val="000000"/>
+                <w:sz w:val="20"/>
+                <w:szCs w:val="20"/>
+              </w:rPr>
+              <w:t xml:space="preserve">        a = x1;</w:t>
+            </w:r>
+          </w:p>
+          <w:p>
+            <w:pPr>
+              <w:autoSpaceDE w:val="0"/>
+              <w:autoSpaceDN w:val="0"/>
+              <w:adjustRightInd w:val="0"/>
+              <w:rPr>
+                <w:rFonts w:ascii="Consolas" w:hAnsi="Consolas" w:cs="Consolas"/>
+                <w:sz w:val="20"/>
+                <w:szCs w:val="20"/>
+              </w:rPr>
+            </w:pPr>
+            <w:r>
+              <w:rPr>
+                <w:rFonts w:ascii="Consolas" w:hAnsi="Consolas" w:cs="Consolas"/>
+                <w:color w:val="000000"/>
+                <w:sz w:val="20"/>
+                <w:szCs w:val="20"/>
+              </w:rPr>
+              <w:t xml:space="preserve">    </w:t>
+            </w:r>
+            <w:proofErr w:type="spellStart"/>
+            <w:r>
+              <w:rPr>
+                <w:rFonts w:ascii="Consolas" w:hAnsi="Consolas" w:cs="Consolas"/>
+                <w:color w:val="0E00FF"/>
+                <w:sz w:val="20"/>
+                <w:szCs w:val="20"/>
+              </w:rPr>
+              <w:t>end</w:t>
+            </w:r>
+            <w:proofErr w:type="spellEnd"/>
+          </w:p>
+          <w:p>
+            <w:pPr>
+              <w:autoSpaceDE w:val="0"/>
+              <w:autoSpaceDN w:val="0"/>
+              <w:adjustRightInd w:val="0"/>
+              <w:rPr>
+                <w:rFonts w:ascii="Consolas" w:hAnsi="Consolas" w:cs="Consolas"/>
+                <w:sz w:val="20"/>
+                <w:szCs w:val="20"/>
+              </w:rPr>
+            </w:pPr>
+            <w:r>
+              <w:rPr>
+                <w:rFonts w:ascii="Consolas" w:hAnsi="Consolas" w:cs="Consolas"/>
+                <w:color w:val="000000"/>
+                <w:sz w:val="20"/>
+                <w:szCs w:val="20"/>
+              </w:rPr>
+              <w:t xml:space="preserve">    </w:t>
+            </w:r>
+          </w:p>
+          <w:p>
+            <w:pPr>
+              <w:autoSpaceDE w:val="0"/>
+              <w:autoSpaceDN w:val="0"/>
+              <w:adjustRightInd w:val="0"/>
+              <w:rPr>
+                <w:rFonts w:ascii="Consolas" w:hAnsi="Consolas" w:cs="Consolas"/>
+                <w:sz w:val="20"/>
+                <w:szCs w:val="20"/>
+              </w:rPr>
+            </w:pPr>
+            <w:r>
+              <w:rPr>
+                <w:rFonts w:ascii="Consolas" w:hAnsi="Consolas" w:cs="Consolas"/>
+                <w:color w:val="000000"/>
+                <w:sz w:val="20"/>
+                <w:szCs w:val="20"/>
+              </w:rPr>
+              <w:t xml:space="preserve">    </w:t>
+            </w:r>
+            <w:proofErr w:type="spellStart"/>
+            <w:r>
+              <w:rPr>
+                <w:rFonts w:ascii="Consolas" w:hAnsi="Consolas" w:cs="Consolas"/>
+                <w:color w:val="000000"/>
+                <w:sz w:val="20"/>
+                <w:szCs w:val="20"/>
+              </w:rPr>
+              <w:t>iter</w:t>
+            </w:r>
+            <w:proofErr w:type="spellEnd"/>
+            <w:r>
+              <w:rPr>
+                <w:rFonts w:ascii="Consolas" w:hAnsi="Consolas" w:cs="Consolas"/>
+                <w:color w:val="000000"/>
+                <w:sz w:val="20"/>
+                <w:szCs w:val="20"/>
+              </w:rPr>
+              <w:t xml:space="preserve"> = </w:t>
+            </w:r>
+            <w:proofErr w:type="spellStart"/>
+            <w:r>
+              <w:rPr>
+                <w:rFonts w:ascii="Consolas" w:hAnsi="Consolas" w:cs="Consolas"/>
+                <w:color w:val="000000"/>
+                <w:sz w:val="20"/>
+                <w:szCs w:val="20"/>
+              </w:rPr>
+              <w:t>iter</w:t>
+            </w:r>
+            <w:proofErr w:type="spellEnd"/>
+            <w:r>
+              <w:rPr>
+                <w:rFonts w:ascii="Consolas" w:hAnsi="Consolas" w:cs="Consolas"/>
+                <w:color w:val="000000"/>
+                <w:sz w:val="20"/>
+                <w:szCs w:val="20"/>
+              </w:rPr>
+              <w:t xml:space="preserve"> + 1;</w:t>
+            </w:r>
+          </w:p>
+          <w:p>
+            <w:pPr>
+              <w:autoSpaceDE w:val="0"/>
+              <w:autoSpaceDN w:val="0"/>
+              <w:adjustRightInd w:val="0"/>
+              <w:rPr>
+                <w:rFonts w:ascii="Consolas" w:hAnsi="Consolas" w:cs="Consolas"/>
+                <w:sz w:val="20"/>
+                <w:szCs w:val="20"/>
+              </w:rPr>
+            </w:pPr>
+            <w:proofErr w:type="spellStart"/>
+            <w:r>
+              <w:rPr>
+                <w:rFonts w:ascii="Consolas" w:hAnsi="Consolas" w:cs="Consolas"/>
+                <w:color w:val="0E00FF"/>
+                <w:sz w:val="20"/>
+                <w:szCs w:val="20"/>
+              </w:rPr>
+              <w:t>end</w:t>
+            </w:r>
+            <w:proofErr w:type="spellEnd"/>
+          </w:p>
+          <w:p>
+            <w:pPr>
+              <w:autoSpaceDE w:val="0"/>
+              <w:autoSpaceDN w:val="0"/>
+              <w:adjustRightInd w:val="0"/>
+              <w:rPr>
+                <w:rFonts w:ascii="Consolas" w:hAnsi="Consolas" w:cs="Consolas"/>
+                <w:sz w:val="20"/>
+                <w:szCs w:val="20"/>
+              </w:rPr>
+            </w:pPr>
+          </w:p>
+          <w:p>
+            <w:pPr>
+              <w:autoSpaceDE w:val="0"/>
+              <w:autoSpaceDN w:val="0"/>
+              <w:adjustRightInd w:val="0"/>
+              <w:rPr>
+                <w:rFonts w:ascii="Consolas" w:hAnsi="Consolas" w:cs="Consolas"/>
+                <w:sz w:val="20"/>
+                <w:szCs w:val="20"/>
+              </w:rPr>
+            </w:pPr>
+            <w:r>
+              <w:rPr>
+                <w:rFonts w:ascii="Consolas" w:hAnsi="Consolas" w:cs="Consolas"/>
+                <w:color w:val="008013"/>
+                <w:sz w:val="20"/>
+                <w:szCs w:val="20"/>
+              </w:rPr>
+              <w:t>% ---------------- RESULTADO ----------------</w:t>
+            </w:r>
+          </w:p>
+          <w:p>
+            <w:pPr>
+              <w:autoSpaceDE w:val="0"/>
+              <w:autoSpaceDN w:val="0"/>
+              <w:adjustRightInd w:val="0"/>
+              <w:rPr>
+                <w:rFonts w:ascii="Consolas" w:hAnsi="Consolas" w:cs="Consolas"/>
+                <w:sz w:val="20"/>
+                <w:szCs w:val="20"/>
+              </w:rPr>
+            </w:pPr>
+            <w:proofErr w:type="spellStart"/>
+            <w:r>
+              <w:rPr>
+                <w:rFonts w:ascii="Consolas" w:hAnsi="Consolas" w:cs="Consolas"/>
+                <w:color w:val="000000"/>
+                <w:sz w:val="20"/>
+                <w:szCs w:val="20"/>
+              </w:rPr>
+              <w:t>xmin</w:t>
+            </w:r>
+            <w:proofErr w:type="spellEnd"/>
+            <w:r>
+              <w:rPr>
+                <w:rFonts w:ascii="Consolas" w:hAnsi="Consolas" w:cs="Consolas"/>
+                <w:color w:val="000000"/>
+                <w:sz w:val="20"/>
+                <w:szCs w:val="20"/>
+              </w:rPr>
+              <w:t xml:space="preserve"> = (a + b)/2;</w:t>
+            </w:r>
+          </w:p>
+          <w:p>
+            <w:pPr>
+              <w:autoSpaceDE w:val="0"/>
+              <w:autoSpaceDN w:val="0"/>
+              <w:adjustRightInd w:val="0"/>
+              <w:rPr>
+                <w:rFonts w:ascii="Consolas" w:hAnsi="Consolas" w:cs="Consolas"/>
+                <w:sz w:val="20"/>
+                <w:szCs w:val="20"/>
+              </w:rPr>
+            </w:pPr>
+            <w:proofErr w:type="spellStart"/>
+            <w:r>
+              <w:rPr>
+                <w:rFonts w:ascii="Consolas" w:hAnsi="Consolas" w:cs="Consolas"/>
+                <w:color w:val="000000"/>
+                <w:sz w:val="20"/>
+                <w:szCs w:val="20"/>
+              </w:rPr>
+              <w:t>fmin</w:t>
+            </w:r>
+            <w:proofErr w:type="spellEnd"/>
+            <w:r>
+              <w:rPr>
+                <w:rFonts w:ascii="Consolas" w:hAnsi="Consolas" w:cs="Consolas"/>
+                <w:color w:val="000000"/>
+                <w:sz w:val="20"/>
+                <w:szCs w:val="20"/>
+              </w:rPr>
+              <w:t xml:space="preserve"> = f(</w:t>
+            </w:r>
+            <w:proofErr w:type="spellStart"/>
+            <w:r>
+              <w:rPr>
+                <w:rFonts w:ascii="Consolas" w:hAnsi="Consolas" w:cs="Consolas"/>
+                <w:color w:val="000000"/>
+                <w:sz w:val="20"/>
+                <w:szCs w:val="20"/>
+              </w:rPr>
+              <w:t>xmin</w:t>
+            </w:r>
+            <w:proofErr w:type="spellEnd"/>
+            <w:r>
+              <w:rPr>
+                <w:rFonts w:ascii="Consolas" w:hAnsi="Consolas" w:cs="Consolas"/>
+                <w:color w:val="000000"/>
+                <w:sz w:val="20"/>
+                <w:szCs w:val="20"/>
+              </w:rPr>
+              <w:t>);</w:t>
+            </w:r>
+          </w:p>
+          <w:p>
+            <w:pPr>
+              <w:autoSpaceDE w:val="0"/>
+              <w:autoSpaceDN w:val="0"/>
+              <w:adjustRightInd w:val="0"/>
+              <w:rPr>
+                <w:rFonts w:ascii="Consolas" w:hAnsi="Consolas" w:cs="Consolas"/>
+                <w:sz w:val="20"/>
+                <w:szCs w:val="20"/>
+              </w:rPr>
+            </w:pPr>
+            <w:r>
+              <w:rPr>
+                <w:rFonts w:ascii="Consolas" w:hAnsi="Consolas" w:cs="Consolas"/>
+                <w:color w:val="000000"/>
+                <w:sz w:val="20"/>
+                <w:szCs w:val="20"/>
+              </w:rPr>
+              <w:t xml:space="preserve">tiempo = </w:t>
+            </w:r>
+            <w:proofErr w:type="spellStart"/>
+            <w:r>
+              <w:rPr>
+                <w:rFonts w:ascii="Consolas" w:hAnsi="Consolas" w:cs="Consolas"/>
+                <w:color w:val="000000"/>
+                <w:sz w:val="20"/>
+                <w:szCs w:val="20"/>
+              </w:rPr>
+              <w:t>toc</w:t>
+            </w:r>
+            <w:proofErr w:type="spellEnd"/>
+            <w:r>
+              <w:rPr>
+                <w:rFonts w:ascii="Consolas" w:hAnsi="Consolas" w:cs="Consolas"/>
+                <w:color w:val="000000"/>
+                <w:sz w:val="20"/>
+                <w:szCs w:val="20"/>
+              </w:rPr>
+              <w:t>;</w:t>
+            </w:r>
+          </w:p>
+          <w:p>
+            <w:pPr>
+              <w:autoSpaceDE w:val="0"/>
+              <w:autoSpaceDN w:val="0"/>
+              <w:adjustRightInd w:val="0"/>
+              <w:rPr>
+                <w:rFonts w:ascii="Consolas" w:hAnsi="Consolas" w:cs="Consolas"/>
+                <w:sz w:val="20"/>
+                <w:szCs w:val="20"/>
+              </w:rPr>
+            </w:pPr>
+          </w:p>
+          <w:p>
+            <w:pPr>
+              <w:autoSpaceDE w:val="0"/>
+              <w:autoSpaceDN w:val="0"/>
+              <w:adjustRightInd w:val="0"/>
+              <w:rPr>
+                <w:rFonts w:ascii="Consolas" w:hAnsi="Consolas" w:cs="Consolas"/>
+                <w:sz w:val="20"/>
+                <w:szCs w:val="20"/>
+              </w:rPr>
+            </w:pPr>
+            <w:proofErr w:type="spellStart"/>
+            <w:r>
+              <w:rPr>
+                <w:rFonts w:ascii="Consolas" w:hAnsi="Consolas" w:cs="Consolas"/>
+                <w:color w:val="0E00FF"/>
+                <w:sz w:val="20"/>
+                <w:szCs w:val="20"/>
+              </w:rPr>
+              <w:t>end</w:t>
+            </w:r>
+            <w:proofErr w:type="spellEnd"/>
+          </w:p>
+        </w:tc>
+      </w:tr>
+    </w:tbl>
+    <w:p>
       <w:pPr>
         <w:rPr>
           <w:noProof/>
@@ -199,6 +1735,7 @@
         <w:rPr>
           <w:noProof/>
         </w:rPr>
+        <w:lastRenderedPageBreak/>
         <w:t>Metodo de interpolacion cuadratica</w:t>
       </w:r>
     </w:p>
@@ -605,6 +2142,9 @@
         <w:jc w:val="center"/>
       </w:pPr>
       <w:r>
+        <w:rPr>
+          <w:noProof/>
+        </w:rPr>
         <w:drawing>
           <wp:inline distT="0" distB="0" distL="0" distR="0" wp14:anchorId="4C544437" wp14:editId="09D461A9">
             <wp:extent cx="2442950" cy="1477219"/>
@@ -663,16 +2203,20 @@
         </w:drawing>
       </w:r>
     </w:p>
+    <w:p/>
     <w:p>
       <w:pPr>
         <w:jc w:val="center"/>
       </w:pPr>
       <w:r>
+        <w:rPr>
+          <w:noProof/>
+        </w:rPr>
         <w:drawing>
-          <wp:inline distT="0" distB="0" distL="0" distR="0" wp14:anchorId="06C5BA77" wp14:editId="676A7012">
-            <wp:extent cx="2862673" cy="3473355"/>
-            <wp:effectExtent l="0" t="0" r="0" b="0"/>
-            <wp:docPr id="1390943857" name="Imagen 1"/>
+          <wp:inline distT="0" distB="0" distL="0" distR="0" wp14:anchorId="76BCFF0F" wp14:editId="0AD0D5E5">
+            <wp:extent cx="3193576" cy="3145790"/>
+            <wp:effectExtent l="0" t="0" r="6985" b="0"/>
+            <wp:docPr id="2090854829" name="Imagen 1"/>
             <wp:cNvGraphicFramePr>
               <a:graphicFrameLocks xmlns:a="http://schemas.openxmlformats.org/drawingml/2006/main" noChangeAspect="1"/>
             </wp:cNvGraphicFramePr>
@@ -680,24 +2224,32 @@
               <a:graphicData uri="http://schemas.openxmlformats.org/drawingml/2006/picture">
                 <pic:pic xmlns:pic="http://schemas.openxmlformats.org/drawingml/2006/picture">
                   <pic:nvPicPr>
-                    <pic:cNvPr id="1390943857" name=""/>
-                    <pic:cNvPicPr/>
+                    <pic:cNvPr id="0" name="Picture 1"/>
+                    <pic:cNvPicPr>
+                      <a:picLocks noChangeAspect="1" noChangeArrowheads="1"/>
+                    </pic:cNvPicPr>
                   </pic:nvPicPr>
                   <pic:blipFill rotWithShape="1">
-                    <a:blip r:embed="rId10">
+                    <a:blip r:embed="rId10" cstate="print">
                       <a:extLst>
                         <a:ext uri="{BEBA8EAE-BF5A-486C-A8C5-ECC9F3942E4B}">
                           <a14:imgProps xmlns:a14="http://schemas.microsoft.com/office/drawing/2010/main">
                             <a14:imgLayer r:embed="rId11">
+                              <a14:imgEffect>
+                                <a14:sharpenSoften amount="50000"/>
+                              </a14:imgEffect>
                               <a14:imgEffect>
                                 <a14:saturation sat="400000"/>
                               </a14:imgEffect>
                             </a14:imgLayer>
                           </a14:imgProps>
                         </a:ext>
+                        <a:ext uri="{28A0092B-C50C-407E-A947-70E740481C1C}">
+                          <a14:useLocalDpi xmlns:a14="http://schemas.microsoft.com/office/drawing/2010/main" val="0"/>
+                        </a:ext>
                       </a:extLst>
                     </a:blip>
-                    <a:srcRect l="33645" t="29479" r="44367" b="22692"/>
+                    <a:srcRect r="39297"/>
                     <a:stretch>
                       <a:fillRect/>
                     </a:stretch>
@@ -705,11 +2257,12 @@
                   <pic:spPr bwMode="auto">
                     <a:xfrm>
                       <a:off x="0" y="0"/>
-                      <a:ext cx="2874677" cy="3487919"/>
+                      <a:ext cx="3193576" cy="3145790"/>
                     </a:xfrm>
                     <a:prstGeom prst="rect">
                       <a:avLst/>
                     </a:prstGeom>
+                    <a:noFill/>
                     <a:ln>
                       <a:noFill/>
                     </a:ln>
@@ -729,6 +2282,189 @@
     <w:p>
       <w:r>
         <w:lastRenderedPageBreak/>
+        <w:t>Viendo las graficas de cada función, se puede obtener los siguientes intervalos para cada función:</w:t>
+      </w:r>
+    </w:p>
+    <w:p>
+      <w:pPr>
+        <w:rPr>
+          <w:rFonts w:eastAsiaTheme="minorEastAsia"/>
+        </w:rPr>
+      </w:pPr>
+      <m:oMathPara>
+        <m:oMath>
+          <m:r>
+            <w:rPr>
+              <w:rFonts w:ascii="Cambria Math" w:hAnsi="Cambria Math"/>
+            </w:rPr>
+            <m:t>f1→</m:t>
+          </m:r>
+          <m:d>
+            <m:dPr>
+              <m:begChr m:val="["/>
+              <m:endChr m:val="]"/>
+              <m:ctrlPr>
+                <w:rPr>
+                  <w:rFonts w:ascii="Cambria Math" w:hAnsi="Cambria Math"/>
+                  <w:i/>
+                </w:rPr>
+              </m:ctrlPr>
+            </m:dPr>
+            <m:e>
+              <m:r>
+                <w:rPr>
+                  <w:rFonts w:ascii="Cambria Math" w:hAnsi="Cambria Math"/>
+                </w:rPr>
+                <m:t>1,2</m:t>
+              </m:r>
+            </m:e>
+          </m:d>
+        </m:oMath>
+      </m:oMathPara>
+    </w:p>
+    <w:p>
+      <w:pPr>
+        <w:rPr>
+          <w:rFonts w:eastAsiaTheme="minorEastAsia"/>
+        </w:rPr>
+      </w:pPr>
+      <m:oMathPara>
+        <m:oMath>
+          <m:r>
+            <w:rPr>
+              <w:rFonts w:ascii="Cambria Math" w:hAnsi="Cambria Math"/>
+            </w:rPr>
+            <m:t>f</m:t>
+          </m:r>
+          <m:r>
+            <w:rPr>
+              <w:rFonts w:ascii="Cambria Math" w:hAnsi="Cambria Math"/>
+            </w:rPr>
+            <m:t>2</m:t>
+          </m:r>
+          <m:r>
+            <w:rPr>
+              <w:rFonts w:ascii="Cambria Math" w:hAnsi="Cambria Math"/>
+            </w:rPr>
+            <m:t>→</m:t>
+          </m:r>
+          <m:d>
+            <m:dPr>
+              <m:begChr m:val="["/>
+              <m:endChr m:val="]"/>
+              <m:ctrlPr>
+                <w:rPr>
+                  <w:rFonts w:ascii="Cambria Math" w:hAnsi="Cambria Math"/>
+                  <w:i/>
+                </w:rPr>
+              </m:ctrlPr>
+            </m:dPr>
+            <m:e>
+              <m:r>
+                <w:rPr>
+                  <w:rFonts w:ascii="Cambria Math" w:hAnsi="Cambria Math"/>
+                </w:rPr>
+                <m:t>7</m:t>
+              </m:r>
+              <m:r>
+                <w:rPr>
+                  <w:rFonts w:ascii="Cambria Math" w:hAnsi="Cambria Math"/>
+                </w:rPr>
+                <m:t>,</m:t>
+              </m:r>
+              <m:r>
+                <w:rPr>
+                  <w:rFonts w:ascii="Cambria Math" w:hAnsi="Cambria Math"/>
+                </w:rPr>
+                <m:t>8</m:t>
+              </m:r>
+            </m:e>
+          </m:d>
+        </m:oMath>
+      </m:oMathPara>
+    </w:p>
+    <w:p>
+      <w:pPr>
+        <w:rPr>
+          <w:rFonts w:eastAsiaTheme="minorEastAsia"/>
+        </w:rPr>
+      </w:pPr>
+      <m:oMathPara>
+        <m:oMath>
+          <m:r>
+            <w:rPr>
+              <w:rFonts w:ascii="Cambria Math" w:hAnsi="Cambria Math"/>
+            </w:rPr>
+            <m:t>f</m:t>
+          </m:r>
+          <m:r>
+            <w:rPr>
+              <w:rFonts w:ascii="Cambria Math" w:hAnsi="Cambria Math"/>
+            </w:rPr>
+            <m:t>3</m:t>
+          </m:r>
+          <m:r>
+            <w:rPr>
+              <w:rFonts w:ascii="Cambria Math" w:hAnsi="Cambria Math"/>
+            </w:rPr>
+            <m:t>→</m:t>
+          </m:r>
+          <m:d>
+            <m:dPr>
+              <m:begChr m:val="["/>
+              <m:endChr m:val="]"/>
+              <m:ctrlPr>
+                <w:rPr>
+                  <w:rFonts w:ascii="Cambria Math" w:hAnsi="Cambria Math"/>
+                  <w:i/>
+                </w:rPr>
+              </m:ctrlPr>
+            </m:dPr>
+            <m:e>
+              <m:r>
+                <w:rPr>
+                  <w:rFonts w:ascii="Cambria Math" w:hAnsi="Cambria Math"/>
+                </w:rPr>
+                <m:t>4</m:t>
+              </m:r>
+              <m:r>
+                <w:rPr>
+                  <w:rFonts w:ascii="Cambria Math" w:hAnsi="Cambria Math"/>
+                </w:rPr>
+                <m:t>,</m:t>
+              </m:r>
+              <m:r>
+                <w:rPr>
+                  <w:rFonts w:ascii="Cambria Math" w:hAnsi="Cambria Math"/>
+                </w:rPr>
+                <m:t>5</m:t>
+              </m:r>
+            </m:e>
+          </m:d>
+        </m:oMath>
+      </m:oMathPara>
+    </w:p>
+    <w:p>
+      <w:pPr>
+        <w:rPr>
+          <w:rFonts w:eastAsiaTheme="minorEastAsia"/>
+        </w:rPr>
+      </w:pPr>
+      <w:r>
+        <w:rPr>
+          <w:rFonts w:eastAsiaTheme="minorEastAsia"/>
+        </w:rPr>
+        <w:t>Todos estos intervalos son</w:t>
+      </w:r>
+      <w:r>
+        <w:rPr>
+          <w:rFonts w:eastAsiaTheme="minorEastAsia"/>
+        </w:rPr>
+        <w:t xml:space="preserve"> unimodales de longitud unitaria.</w:t>
+      </w:r>
+    </w:p>
+    <w:p>
+      <w:r>
         <w:t>Para la cuarta función, ha sido necesario dibujarla utilizando Matlab ya que esta definida de forma numérica. Siguiendo las indicaciones dadas, se ha buscado el intervalo dentro del intervalo [1,4].</w:t>
       </w:r>
     </w:p>
@@ -1097,6 +2833,821 @@
             </a:graphic>
           </wp:inline>
         </w:drawing>
+      </w:r>
+    </w:p>
+    <w:p>
+      <w:r>
+        <w:t xml:space="preserve">Para la última función, podemos apreciar </w:t>
+      </w:r>
+      <w:r>
+        <w:t xml:space="preserve">que </w:t>
+      </w:r>
+      <w:r>
+        <w:t>el intervalo necesario</w:t>
+      </w:r>
+      <w:r>
+        <w:t xml:space="preserve"> es</w:t>
+      </w:r>
+      <w:r>
+        <w:t>:</w:t>
+      </w:r>
+    </w:p>
+    <w:p>
+      <w:pPr>
+        <w:rPr>
+          <w:rFonts w:eastAsiaTheme="minorEastAsia"/>
+        </w:rPr>
+      </w:pPr>
+      <m:oMathPara>
+        <m:oMath>
+          <m:r>
+            <w:rPr>
+              <w:rFonts w:ascii="Cambria Math" w:hAnsi="Cambria Math"/>
+            </w:rPr>
+            <m:t>f</m:t>
+          </m:r>
+          <m:r>
+            <w:rPr>
+              <w:rFonts w:ascii="Cambria Math" w:hAnsi="Cambria Math"/>
+            </w:rPr>
+            <m:t>4</m:t>
+          </m:r>
+          <m:r>
+            <w:rPr>
+              <w:rFonts w:ascii="Cambria Math" w:hAnsi="Cambria Math"/>
+            </w:rPr>
+            <m:t>→</m:t>
+          </m:r>
+          <m:d>
+            <m:dPr>
+              <m:begChr m:val="["/>
+              <m:endChr m:val="]"/>
+              <m:ctrlPr>
+                <w:rPr>
+                  <w:rFonts w:ascii="Cambria Math" w:hAnsi="Cambria Math"/>
+                  <w:i/>
+                </w:rPr>
+              </m:ctrlPr>
+            </m:dPr>
+            <m:e>
+              <m:r>
+                <w:rPr>
+                  <w:rFonts w:ascii="Cambria Math" w:hAnsi="Cambria Math"/>
+                </w:rPr>
+                <m:t>2</m:t>
+              </m:r>
+              <m:r>
+                <w:rPr>
+                  <w:rFonts w:ascii="Cambria Math" w:hAnsi="Cambria Math"/>
+                </w:rPr>
+                <m:t>,</m:t>
+              </m:r>
+              <m:r>
+                <w:rPr>
+                  <w:rFonts w:ascii="Cambria Math" w:hAnsi="Cambria Math"/>
+                </w:rPr>
+                <m:t>3</m:t>
+              </m:r>
+            </m:e>
+          </m:d>
+        </m:oMath>
+      </m:oMathPara>
+    </w:p>
+    <w:p>
+      <w:r>
+        <w:lastRenderedPageBreak/>
+        <w:t xml:space="preserve">Teniendo ya estos cuatro intervalos </w:t>
+      </w:r>
+      <w:r>
+        <w:t xml:space="preserve">encontrados, podemos utilizar las diferentes funciones para cada método y obtener </w:t>
+      </w:r>
+      <w:r>
+        <w:t xml:space="preserve">el resultado. A </w:t>
+      </w:r>
+      <w:r>
+        <w:t>continuación,</w:t>
+      </w:r>
+      <w:r>
+        <w:t xml:space="preserve"> el código general para la realización y representación de los resultados de cada método.</w:t>
+      </w:r>
+    </w:p>
+    <w:tbl>
+      <w:tblPr>
+        <w:tblStyle w:val="Tablaconcuadrcula"/>
+        <w:tblW w:w="0" w:type="auto"/>
+        <w:tblLook w:val="04A0" w:firstRow="1" w:lastRow="0" w:firstColumn="1" w:lastColumn="0" w:noHBand="0" w:noVBand="1"/>
+      </w:tblPr>
+      <w:tblGrid>
+        <w:gridCol w:w="8296"/>
+      </w:tblGrid>
+      <w:tr>
+        <w:tc>
+          <w:tcPr>
+            <w:tcW w:w="8296" w:type="dxa"/>
+          </w:tcPr>
+          <w:p/>
+        </w:tc>
+      </w:tr>
+    </w:tbl>
+    <w:p>
+      <w:pPr>
+        <w:pStyle w:val="Ttulo1"/>
+      </w:pPr>
+      <w:r>
+        <w:t xml:space="preserve">Resultados de los métodos de </w:t>
+      </w:r>
+      <w:r>
+        <w:t>búsqueda</w:t>
+      </w:r>
+    </w:p>
+    <w:p>
+      <w:r>
+        <w:t xml:space="preserve">En este apartado se presentan los resultados obtenidos de cada </w:t>
+      </w:r>
+      <w:r>
+        <w:t xml:space="preserve">método. Esto nos permite comparar los resultados y seleccionar mejores o peores </w:t>
+      </w:r>
+      <w:r>
+        <w:t>métodos, incluso diferenciando por función de ser lo correcto</w:t>
+      </w:r>
+    </w:p>
+    <w:p>
+      <w:pPr>
+        <w:pStyle w:val="Ttulo2"/>
+      </w:pPr>
+      <w:r>
+        <w:t>Método de búsqueda dicotómica</w:t>
+      </w:r>
+    </w:p>
+    <w:tbl>
+      <w:tblPr>
+        <w:tblStyle w:val="Tablaconcuadrcula"/>
+        <w:tblW w:w="0" w:type="auto"/>
+        <w:tblLook w:val="04A0" w:firstRow="1" w:lastRow="0" w:firstColumn="1" w:lastColumn="0" w:noHBand="0" w:noVBand="1"/>
+      </w:tblPr>
+      <w:tblGrid>
+        <w:gridCol w:w="2256"/>
+        <w:gridCol w:w="1425"/>
+        <w:gridCol w:w="1301"/>
+        <w:gridCol w:w="1657"/>
+        <w:gridCol w:w="1657"/>
+      </w:tblGrid>
+      <w:tr>
+        <w:tc>
+          <w:tcPr>
+            <w:tcW w:w="2256" w:type="dxa"/>
+          </w:tcPr>
+          <w:p>
+            <w:pPr>
+              <w:jc w:val="center"/>
+              <w:rPr>
+                <w:b/>
+                <w:bCs/>
+                <w:u w:val="single"/>
+              </w:rPr>
+            </w:pPr>
+            <w:r>
+              <w:rPr>
+                <w:b/>
+                <w:bCs/>
+                <w:u w:val="single"/>
+              </w:rPr>
+              <w:t>Función</w:t>
+            </w:r>
+          </w:p>
+        </w:tc>
+        <w:tc>
+          <w:tcPr>
+            <w:tcW w:w="1425" w:type="dxa"/>
+          </w:tcPr>
+          <w:p>
+            <w:pPr>
+              <w:jc w:val="center"/>
+              <w:rPr>
+                <w:b/>
+                <w:bCs/>
+                <w:u w:val="single"/>
+              </w:rPr>
+            </w:pPr>
+            <w:proofErr w:type="spellStart"/>
+            <w:r>
+              <w:rPr>
+                <w:b/>
+                <w:bCs/>
+                <w:u w:val="single"/>
+              </w:rPr>
+              <w:t>xmin</w:t>
+            </w:r>
+            <w:proofErr w:type="spellEnd"/>
+          </w:p>
+        </w:tc>
+        <w:tc>
+          <w:tcPr>
+            <w:tcW w:w="1301" w:type="dxa"/>
+          </w:tcPr>
+          <w:p>
+            <w:pPr>
+              <w:jc w:val="center"/>
+              <w:rPr>
+                <w:b/>
+                <w:bCs/>
+                <w:u w:val="single"/>
+              </w:rPr>
+            </w:pPr>
+            <w:proofErr w:type="spellStart"/>
+            <w:r>
+              <w:rPr>
+                <w:b/>
+                <w:bCs/>
+                <w:u w:val="single"/>
+              </w:rPr>
+              <w:t>fmin</w:t>
+            </w:r>
+            <w:proofErr w:type="spellEnd"/>
+          </w:p>
+        </w:tc>
+        <w:tc>
+          <w:tcPr>
+            <w:tcW w:w="1657" w:type="dxa"/>
+          </w:tcPr>
+          <w:p>
+            <w:pPr>
+              <w:jc w:val="center"/>
+              <w:rPr>
+                <w:b/>
+                <w:bCs/>
+                <w:u w:val="single"/>
+              </w:rPr>
+            </w:pPr>
+            <w:r>
+              <w:rPr>
+                <w:b/>
+                <w:bCs/>
+                <w:u w:val="single"/>
+              </w:rPr>
+              <w:t>iteraciones</w:t>
+            </w:r>
+          </w:p>
+        </w:tc>
+        <w:tc>
+          <w:tcPr>
+            <w:tcW w:w="1657" w:type="dxa"/>
+          </w:tcPr>
+          <w:p>
+            <w:pPr>
+              <w:jc w:val="center"/>
+              <w:rPr>
+                <w:b/>
+                <w:bCs/>
+                <w:u w:val="single"/>
+              </w:rPr>
+            </w:pPr>
+            <w:r>
+              <w:rPr>
+                <w:b/>
+                <w:bCs/>
+                <w:u w:val="single"/>
+              </w:rPr>
+              <w:t>tiempo</w:t>
+            </w:r>
+          </w:p>
+        </w:tc>
+      </w:tr>
+      <w:tr>
+        <w:tc>
+          <w:tcPr>
+            <w:tcW w:w="2256" w:type="dxa"/>
+          </w:tcPr>
+          <w:p>
+            <w:pPr>
+              <w:jc w:val="both"/>
+            </w:pPr>
+            <m:oMathPara>
+              <m:oMathParaPr>
+                <m:jc m:val="left"/>
+              </m:oMathParaPr>
+              <m:oMath>
+                <m:r>
+                  <w:rPr>
+                    <w:rFonts w:ascii="Cambria Math" w:hAnsi="Cambria Math"/>
+                  </w:rPr>
+                  <m:t>f</m:t>
+                </m:r>
+                <m:d>
+                  <m:dPr>
+                    <m:ctrlPr>
+                      <w:rPr>
+                        <w:rFonts w:ascii="Cambria Math" w:hAnsi="Cambria Math"/>
+                      </w:rPr>
+                    </m:ctrlPr>
+                  </m:dPr>
+                  <m:e>
+                    <m:r>
+                      <w:rPr>
+                        <w:rFonts w:ascii="Cambria Math" w:hAnsi="Cambria Math"/>
+                      </w:rPr>
+                      <m:t>x</m:t>
+                    </m:r>
+                  </m:e>
+                </m:d>
+                <m:r>
+                  <m:rPr>
+                    <m:sty m:val="p"/>
+                  </m:rPr>
+                  <w:rPr>
+                    <w:rFonts w:ascii="Cambria Math" w:hAnsi="Cambria Math"/>
+                  </w:rPr>
+                  <m:t>=</m:t>
+                </m:r>
+                <m:sSup>
+                  <m:sSupPr>
+                    <m:ctrlPr>
+                      <w:rPr>
+                        <w:rFonts w:ascii="Cambria Math" w:hAnsi="Cambria Math"/>
+                      </w:rPr>
+                    </m:ctrlPr>
+                  </m:sSupPr>
+                  <m:e>
+                    <m:r>
+                      <w:rPr>
+                        <w:rFonts w:ascii="Cambria Math" w:hAnsi="Cambria Math"/>
+                      </w:rPr>
+                      <m:t>x</m:t>
+                    </m:r>
+                  </m:e>
+                  <m:sup>
+                    <m:r>
+                      <m:rPr>
+                        <m:sty m:val="p"/>
+                      </m:rPr>
+                      <w:rPr>
+                        <w:rFonts w:ascii="Cambria Math" w:hAnsi="Cambria Math"/>
+                      </w:rPr>
+                      <m:t>6</m:t>
+                    </m:r>
+                  </m:sup>
+                </m:sSup>
+                <m:r>
+                  <m:rPr>
+                    <m:sty m:val="p"/>
+                  </m:rPr>
+                  <w:rPr>
+                    <w:rFonts w:ascii="Cambria Math" w:hAnsi="Cambria Math"/>
+                  </w:rPr>
+                  <m:t>-7</m:t>
+                </m:r>
+                <m:sSup>
+                  <m:sSupPr>
+                    <m:ctrlPr>
+                      <w:rPr>
+                        <w:rFonts w:ascii="Cambria Math" w:hAnsi="Cambria Math"/>
+                      </w:rPr>
+                    </m:ctrlPr>
+                  </m:sSupPr>
+                  <m:e>
+                    <m:r>
+                      <w:rPr>
+                        <w:rFonts w:ascii="Cambria Math" w:hAnsi="Cambria Math"/>
+                      </w:rPr>
+                      <m:t>x</m:t>
+                    </m:r>
+                  </m:e>
+                  <m:sup>
+                    <m:r>
+                      <m:rPr>
+                        <m:sty m:val="p"/>
+                      </m:rPr>
+                      <w:rPr>
+                        <w:rFonts w:ascii="Cambria Math" w:hAnsi="Cambria Math"/>
+                      </w:rPr>
+                      <m:t>3</m:t>
+                    </m:r>
+                  </m:sup>
+                </m:sSup>
+                <m:r>
+                  <m:rPr>
+                    <m:sty m:val="p"/>
+                  </m:rPr>
+                  <w:rPr>
+                    <w:rFonts w:ascii="Cambria Math" w:hAnsi="Cambria Math"/>
+                  </w:rPr>
+                  <m:t>+</m:t>
+                </m:r>
+                <m:r>
+                  <m:rPr>
+                    <m:sty m:val="p"/>
+                  </m:rPr>
+                  <w:rPr>
+                    <w:rFonts w:ascii="Cambria Math" w:hAnsi="Cambria Math"/>
+                  </w:rPr>
+                  <m:t>7</m:t>
+                </m:r>
+              </m:oMath>
+            </m:oMathPara>
+          </w:p>
+        </w:tc>
+        <w:tc>
+          <w:tcPr>
+            <w:tcW w:w="1425" w:type="dxa"/>
+          </w:tcPr>
+          <w:p>
+            <w:r>
+              <w:t>1.5183</w:t>
+            </w:r>
+          </w:p>
+        </w:tc>
+        <w:tc>
+          <w:tcPr>
+            <w:tcW w:w="1301" w:type="dxa"/>
+          </w:tcPr>
+          <w:p>
+            <w:r>
+              <w:t>-5.2500</w:t>
+            </w:r>
+          </w:p>
+        </w:tc>
+        <w:tc>
+          <w:tcPr>
+            <w:tcW w:w="1657" w:type="dxa"/>
+          </w:tcPr>
+          <w:p>
+            <w:r>
+              <w:t>1000</w:t>
+            </w:r>
+          </w:p>
+        </w:tc>
+        <w:tc>
+          <w:tcPr>
+            <w:tcW w:w="1657" w:type="dxa"/>
+          </w:tcPr>
+          <w:p>
+            <w:r>
+              <w:t>0.0018882</w:t>
+            </w:r>
+          </w:p>
+        </w:tc>
+      </w:tr>
+      <w:tr>
+        <w:tc>
+          <w:tcPr>
+            <w:tcW w:w="2256" w:type="dxa"/>
+          </w:tcPr>
+          <w:p>
+            <w:pPr>
+              <w:jc w:val="both"/>
+            </w:pPr>
+            <m:oMathPara>
+              <m:oMathParaPr>
+                <m:jc m:val="left"/>
+              </m:oMathParaPr>
+              <m:oMath>
+                <m:r>
+                  <w:rPr>
+                    <w:rFonts w:ascii="Cambria Math" w:hAnsi="Cambria Math"/>
+                  </w:rPr>
+                  <m:t>f</m:t>
+                </m:r>
+                <m:d>
+                  <m:dPr>
+                    <m:ctrlPr>
+                      <w:rPr>
+                        <w:rFonts w:ascii="Cambria Math" w:hAnsi="Cambria Math"/>
+                      </w:rPr>
+                    </m:ctrlPr>
+                  </m:dPr>
+                  <m:e>
+                    <m:r>
+                      <w:rPr>
+                        <w:rFonts w:ascii="Cambria Math" w:hAnsi="Cambria Math"/>
+                      </w:rPr>
+                      <m:t>x</m:t>
+                    </m:r>
+                  </m:e>
+                </m:d>
+                <m:r>
+                  <m:rPr>
+                    <m:sty m:val="p"/>
+                  </m:rPr>
+                  <w:rPr>
+                    <w:rFonts w:ascii="Cambria Math" w:hAnsi="Cambria Math"/>
+                    <w:lang w:val="es-419"/>
+                  </w:rPr>
+                  <m:t>=</m:t>
+                </m:r>
+                <m:func>
+                  <m:funcPr>
+                    <m:ctrlPr>
+                      <w:rPr>
+                        <w:rFonts w:ascii="Cambria Math" w:hAnsi="Cambria Math"/>
+                        <w:lang w:val="es-419"/>
+                      </w:rPr>
+                    </m:ctrlPr>
+                  </m:funcPr>
+                  <m:fName>
+                    <m:r>
+                      <m:rPr>
+                        <m:sty m:val="p"/>
+                      </m:rPr>
+                      <w:rPr>
+                        <w:rFonts w:ascii="Cambria Math" w:hAnsi="Cambria Math"/>
+                        <w:lang w:val="es-419"/>
+                      </w:rPr>
+                      <m:t>ln</m:t>
+                    </m:r>
+                  </m:fName>
+                  <m:e>
+                    <m:r>
+                      <w:rPr>
+                        <w:rFonts w:ascii="Cambria Math" w:hAnsi="Cambria Math"/>
+                        <w:lang w:val="es-419"/>
+                      </w:rPr>
+                      <m:t>x</m:t>
+                    </m:r>
+                    <m:r>
+                      <m:rPr>
+                        <m:sty m:val="p"/>
+                      </m:rPr>
+                      <w:rPr>
+                        <w:rFonts w:ascii="Cambria Math" w:hAnsi="Cambria Math"/>
+                        <w:lang w:val="es-419"/>
+                      </w:rPr>
+                      <m:t xml:space="preserve">-sen </m:t>
+                    </m:r>
+                    <m:r>
+                      <w:rPr>
+                        <w:rFonts w:ascii="Cambria Math" w:hAnsi="Cambria Math"/>
+                        <w:lang w:val="es-419"/>
+                      </w:rPr>
+                      <m:t>x</m:t>
+                    </m:r>
+                  </m:e>
+                </m:func>
+              </m:oMath>
+            </m:oMathPara>
+          </w:p>
+        </w:tc>
+        <w:tc>
+          <w:tcPr>
+            <w:tcW w:w="1425" w:type="dxa"/>
+          </w:tcPr>
+          <w:p>
+            <w:r>
+              <w:t>7.7242</w:t>
+            </w:r>
+          </w:p>
+        </w:tc>
+        <w:tc>
+          <w:tcPr>
+            <w:tcW w:w="1301" w:type="dxa"/>
+          </w:tcPr>
+          <w:p>
+            <w:r>
+              <w:t>1.0528</w:t>
+            </w:r>
+          </w:p>
+        </w:tc>
+        <w:tc>
+          <w:tcPr>
+            <w:tcW w:w="1657" w:type="dxa"/>
+          </w:tcPr>
+          <w:p>
+            <w:r>
+              <w:t>1000</w:t>
+            </w:r>
+          </w:p>
+        </w:tc>
+        <w:tc>
+          <w:tcPr>
+            <w:tcW w:w="1657" w:type="dxa"/>
+          </w:tcPr>
+          <w:p>
+            <w:r>
+              <w:t>0.0014872</w:t>
+            </w:r>
+          </w:p>
+        </w:tc>
+      </w:tr>
+      <w:tr>
+        <w:tc>
+          <w:tcPr>
+            <w:tcW w:w="2256" w:type="dxa"/>
+          </w:tcPr>
+          <w:p>
+            <w:pPr>
+              <w:jc w:val="both"/>
+            </w:pPr>
+            <m:oMathPara>
+              <m:oMathParaPr>
+                <m:jc m:val="left"/>
+              </m:oMathParaPr>
+              <m:oMath>
+                <m:r>
+                  <w:rPr>
+                    <w:rFonts w:ascii="Cambria Math" w:hAnsi="Cambria Math"/>
+                  </w:rPr>
+                  <m:t>f</m:t>
+                </m:r>
+                <m:d>
+                  <m:dPr>
+                    <m:ctrlPr>
+                      <w:rPr>
+                        <w:rFonts w:ascii="Cambria Math" w:hAnsi="Cambria Math"/>
+                      </w:rPr>
+                    </m:ctrlPr>
+                  </m:dPr>
+                  <m:e>
+                    <m:r>
+                      <w:rPr>
+                        <w:rFonts w:ascii="Cambria Math" w:hAnsi="Cambria Math"/>
+                      </w:rPr>
+                      <m:t>x</m:t>
+                    </m:r>
+                  </m:e>
+                </m:d>
+                <m:r>
+                  <m:rPr>
+                    <m:sty m:val="p"/>
+                  </m:rPr>
+                  <w:rPr>
+                    <w:rFonts w:ascii="Cambria Math" w:hAnsi="Cambria Math"/>
+                  </w:rPr>
+                  <m:t>=</m:t>
+                </m:r>
+                <m:sSup>
+                  <m:sSupPr>
+                    <m:ctrlPr>
+                      <w:rPr>
+                        <w:rFonts w:ascii="Cambria Math" w:hAnsi="Cambria Math"/>
+                      </w:rPr>
+                    </m:ctrlPr>
+                  </m:sSupPr>
+                  <m:e>
+                    <m:r>
+                      <w:rPr>
+                        <w:rFonts w:ascii="Cambria Math" w:hAnsi="Cambria Math"/>
+                      </w:rPr>
+                      <m:t>e</m:t>
+                    </m:r>
+                  </m:e>
+                  <m:sup>
+                    <m:r>
+                      <m:rPr>
+                        <m:nor/>
+                      </m:rPr>
+                      <m:t xml:space="preserve">cos </m:t>
+                    </m:r>
+                    <m:r>
+                      <w:rPr>
+                        <w:rFonts w:ascii="Cambria Math" w:hAnsi="Cambria Math"/>
+                      </w:rPr>
+                      <m:t>x</m:t>
+                    </m:r>
+                  </m:sup>
+                </m:sSup>
+                <m:r>
+                  <m:rPr>
+                    <m:sty m:val="p"/>
+                  </m:rPr>
+                  <w:rPr>
+                    <w:rFonts w:ascii="Cambria Math" w:hAnsi="Cambria Math"/>
+                  </w:rPr>
+                  <m:t>-</m:t>
+                </m:r>
+                <m:r>
+                  <w:rPr>
+                    <w:rFonts w:ascii="Cambria Math" w:hAnsi="Cambria Math"/>
+                  </w:rPr>
+                  <m:t>x</m:t>
+                </m:r>
+              </m:oMath>
+            </m:oMathPara>
+          </w:p>
+        </w:tc>
+        <w:tc>
+          <w:tcPr>
+            <w:tcW w:w="1425" w:type="dxa"/>
+          </w:tcPr>
+          <w:p>
+            <w:r>
+              <w:t>4.7124</w:t>
+            </w:r>
+          </w:p>
+        </w:tc>
+        <w:tc>
+          <w:tcPr>
+            <w:tcW w:w="1301" w:type="dxa"/>
+          </w:tcPr>
+          <w:p>
+            <w:r>
+              <w:t>-3.7124</w:t>
+            </w:r>
+          </w:p>
+        </w:tc>
+        <w:tc>
+          <w:tcPr>
+            <w:tcW w:w="1657" w:type="dxa"/>
+          </w:tcPr>
+          <w:p>
+            <w:r>
+              <w:t>1000</w:t>
+            </w:r>
+          </w:p>
+        </w:tc>
+        <w:tc>
+          <w:tcPr>
+            <w:tcW w:w="1657" w:type="dxa"/>
+          </w:tcPr>
+          <w:p>
+            <w:r>
+              <w:t>0.0008666</w:t>
+            </w:r>
+          </w:p>
+        </w:tc>
+      </w:tr>
+      <w:tr>
+        <w:trPr>
+          <w:trHeight w:val="53"/>
+        </w:trPr>
+        <w:tc>
+          <w:tcPr>
+            <w:tcW w:w="2256" w:type="dxa"/>
+          </w:tcPr>
+          <w:p>
+            <w:proofErr w:type="spellStart"/>
+            <w:r>
+              <w:t>Funcionrr</w:t>
+            </w:r>
+            <w:proofErr w:type="spellEnd"/>
+          </w:p>
+        </w:tc>
+        <w:tc>
+          <w:tcPr>
+            <w:tcW w:w="1425" w:type="dxa"/>
+          </w:tcPr>
+          <w:p>
+            <w:r>
+              <w:t>2.5574</w:t>
+            </w:r>
+          </w:p>
+        </w:tc>
+        <w:tc>
+          <w:tcPr>
+            <w:tcW w:w="1301" w:type="dxa"/>
+          </w:tcPr>
+          <w:p>
+            <w:r>
+              <w:t>0.97258</w:t>
+            </w:r>
+          </w:p>
+        </w:tc>
+        <w:tc>
+          <w:tcPr>
+            <w:tcW w:w="1657" w:type="dxa"/>
+          </w:tcPr>
+          <w:p>
+            <w:r>
+              <w:t>1000</w:t>
+            </w:r>
+          </w:p>
+        </w:tc>
+        <w:tc>
+          <w:tcPr>
+            <w:tcW w:w="1657" w:type="dxa"/>
+          </w:tcPr>
+          <w:p>
+            <w:r>
+              <w:t>10.0220</w:t>
+            </w:r>
+          </w:p>
+        </w:tc>
+      </w:tr>
+    </w:tbl>
+    <w:p>
+      <w:pPr>
+        <w:pStyle w:val="Ttulo2"/>
+      </w:pPr>
+      <w:r>
+        <w:t>Método de</w:t>
+      </w:r>
+      <w:r>
+        <w:t xml:space="preserve"> interpolación cuadrática</w:t>
+      </w:r>
+    </w:p>
+    <w:p/>
+    <w:p>
+      <w:pPr>
+        <w:pStyle w:val="Ttulo2"/>
+      </w:pPr>
+      <w:r>
+        <w:t>Método de Newton</w:t>
+      </w:r>
+    </w:p>
+    <w:p>
+      <w:pPr>
+        <w:pStyle w:val="Ttulo2"/>
+      </w:pPr>
+      <w:r>
+        <w:t>Método de las rectas inexactas</w:t>
       </w:r>
     </w:p>
     <w:sectPr>
@@ -2144,7 +4695,7 @@
     <w:uiPriority w:val="9"/>
     <w:unhideWhenUsed/>
     <w:qFormat/>
-    <w:rsid w:val="00333D0D"/>
+    <w:rsid w:val="002B7673"/>
     <w:pPr>
       <w:keepNext/>
       <w:keepLines/>
@@ -2154,7 +4705,6 @@
     </w:pPr>
     <w:rPr>
       <w:rFonts w:asciiTheme="majorHAnsi" w:eastAsiaTheme="majorEastAsia" w:hAnsiTheme="majorHAnsi" w:cstheme="majorBidi"/>
-      <w:caps/>
       <w:color w:val="007789" w:themeColor="accent1" w:themeShade="BF"/>
       <w:sz w:val="24"/>
     </w:rPr>
@@ -2275,7 +4825,6 @@
   <w:style w:type="character" w:default="1" w:styleId="Fuentedeprrafopredeter">
     <w:name w:val="Default Paragraph Font"/>
     <w:uiPriority w:val="1"/>
-    <w:semiHidden/>
     <w:unhideWhenUsed/>
   </w:style>
   <w:style w:type="table" w:default="1" w:styleId="Tablanormal">
@@ -2316,10 +4865,9 @@
     <w:basedOn w:val="Fuentedeprrafopredeter"/>
     <w:link w:val="Ttulo2"/>
     <w:uiPriority w:val="9"/>
-    <w:rsid w:val="00333D0D"/>
+    <w:rsid w:val="002B7673"/>
     <w:rPr>
       <w:rFonts w:asciiTheme="majorHAnsi" w:eastAsiaTheme="majorEastAsia" w:hAnsiTheme="majorHAnsi" w:cstheme="majorBidi"/>
-      <w:caps/>
       <w:color w:val="007789" w:themeColor="accent1" w:themeShade="BF"/>
       <w:sz w:val="24"/>
     </w:rPr>
@@ -3208,6 +5756,13 @@
     <w:pitch w:val="fixed"/>
     <w:sig w:usb0="E00006FF" w:usb1="0000FCFF" w:usb2="00000001" w:usb3="00000000" w:csb0="0000019F" w:csb1="00000000"/>
   </w:font>
+  <w:font w:name="Cambria Math">
+    <w:panose1 w:val="02040503050406030204"/>
+    <w:charset w:val="00"/>
+    <w:family w:val="roman"/>
+    <w:pitch w:val="variable"/>
+    <w:sig w:usb0="E00006FF" w:usb1="420024FF" w:usb2="02000000" w:usb3="00000000" w:csb0="0000019F" w:csb1="00000000"/>
+  </w:font>
   <w:font w:name="Aptos">
     <w:charset w:val="00"/>
     <w:family w:val="swiss"/>
@@ -3268,6 +5823,9 @@
   <w:rsids>
     <w:rsidRoot w:val="00F15455"/>
     <w:rsid w:val="00245460"/>
+    <w:rsid w:val="005416E1"/>
+    <w:rsid w:val="005918D2"/>
+    <w:rsid w:val="00961B33"/>
     <w:rsid w:val="00B00636"/>
     <w:rsid w:val="00F15455"/>
   </w:rsids>
@@ -3746,6 +6304,16 @@
       <w14:ligatures w14:val="none"/>
     </w:rPr>
   </w:style>
+  <w:style w:type="character" w:styleId="Textodelmarcadordeposicin">
+    <w:name w:val="Placeholder Text"/>
+    <w:basedOn w:val="Fuentedeprrafopredeter"/>
+    <w:uiPriority w:val="99"/>
+    <w:semiHidden/>
+    <w:rsid w:val="005416E1"/>
+    <w:rPr>
+      <w:color w:val="595959" w:themeColor="text1" w:themeTint="A6"/>
+    </w:rPr>
+  </w:style>
 </w:styles>
 </file>
 

</xml_diff>